<commit_message>
po: lab1, lab2: minor impovements
</commit_message>
<xml_diff>
--- a/po/lab2/report/lab2-report.docx
+++ b/po/lab2/report/lab2-report.docx
@@ -10,8 +10,10 @@
           <w:lang w:val="ru-RU"/>
         </w:rPr>
       </w:pPr>
-      <w:bookmarkStart w:id="0" w:name="отчёт-по-лабораторной-работе-2"/>
-      <w:bookmarkStart w:id="1" w:name="задание"/>
+      <w:bookmarkStart w:id="0" w:name="задание"/>
+      <w:bookmarkStart w:id="1" w:name="отчёт-по-лабораторной-работе-2"/>
+      <w:bookmarkStart w:id="2" w:name="_GoBack"/>
+      <w:bookmarkEnd w:id="2"/>
       <w:r>
         <w:rPr>
           <w:rFonts w:ascii="Times New Roman" w:eastAsia="Times New Roman" w:hAnsi="Times New Roman" w:cs="Times New Roman"/>
@@ -99,8 +101,6 @@
         </w:rPr>
         <w:t>:</w:t>
       </w:r>
-      <w:bookmarkStart w:id="2" w:name="_GoBack"/>
-      <w:bookmarkEnd w:id="2"/>
     </w:p>
     <w:p>
       <w:pPr>
@@ -264,7 +264,7 @@
         </w:rPr>
       </w:pPr>
       <w:bookmarkStart w:id="3" w:name="ход-выполнения"/>
-      <w:bookmarkEnd w:id="1"/>
+      <w:bookmarkEnd w:id="0"/>
       <w:r>
         <w:rPr>
           <w:rFonts w:ascii="Times New Roman" w:eastAsia="Times New Roman" w:hAnsi="Times New Roman" w:cs="Times New Roman"/>
@@ -290,16 +290,7 @@
           <w:sz w:val="28"/>
           <w:lang w:val="ru-RU"/>
         </w:rPr>
-        <w:t>В ходе выполнения лабораторной работы была разработана объектно-ориентированная модель телефонной книги. Для хранения одн</w:t>
-      </w:r>
-      <w:r>
-        <w:rPr>
-          <w:rFonts w:ascii="Times New Roman" w:eastAsia="Times New Roman" w:hAnsi="Times New Roman" w:cs="Times New Roman"/>
-          <w:color w:val="000000"/>
-          <w:sz w:val="28"/>
-          <w:lang w:val="ru-RU"/>
-        </w:rPr>
-        <w:t xml:space="preserve">ой записи введена структура </w:t>
+        <w:t xml:space="preserve">В ходе выполнения лабораторной работы была разработана объектно-ориентированная модель телефонной книги. Для хранения одной записи введена структура </w:t>
       </w:r>
       <w:proofErr w:type="spellStart"/>
       <w:r>
@@ -388,16 +379,7 @@
           <w:color w:val="000000"/>
           <w:sz w:val="28"/>
         </w:rPr>
-        <w:t>PhoneBookCon</w:t>
-      </w:r>
-      <w:r>
-        <w:rPr>
-          <w:rStyle w:val="VerbatimChar"/>
-          <w:rFonts w:ascii="Times New Roman" w:eastAsia="Times New Roman" w:hAnsi="Times New Roman" w:cs="Times New Roman"/>
-          <w:color w:val="000000"/>
-          <w:sz w:val="28"/>
-        </w:rPr>
-        <w:t>trol</w:t>
+        <w:t>PhoneBookControl</w:t>
       </w:r>
       <w:proofErr w:type="spellEnd"/>
       <w:r>
@@ -521,16 +503,7 @@
           <w:sz w:val="28"/>
           <w:lang w:val="ru-RU"/>
         </w:rPr>
-        <w:t xml:space="preserve">. Форма </w:t>
-      </w:r>
-      <w:r>
-        <w:rPr>
-          <w:rFonts w:ascii="Times New Roman" w:eastAsia="Times New Roman" w:hAnsi="Times New Roman" w:cs="Times New Roman"/>
-          <w:color w:val="000000"/>
-          <w:sz w:val="28"/>
-          <w:lang w:val="ru-RU"/>
-        </w:rPr>
-        <w:t xml:space="preserve">предоставляет поля ввода имени и номера, список записей, команды добавления, редактирования, поиска, удаления, очистки, создания новой книги, открытия и сохранения файла. Окно справки вызывается из меню и загружает текст из отдельного файла </w:t>
+        <w:t xml:space="preserve">. Форма предоставляет поля ввода имени и номера, список записей, команды добавления, редактирования, поиска, удаления, очистки, создания новой книги, открытия и сохранения файла. Окно справки вызывается из меню и загружает текст из отдельного файла </w:t>
       </w:r>
       <w:r>
         <w:rPr>
@@ -586,8 +559,9 @@
           <w:sz w:val="28"/>
           <w:lang w:val="ru-RU"/>
         </w:rPr>
-        <w:t>Для о</w:t>
-      </w:r>
+        <w:t xml:space="preserve">Для отображения ошибок в интерфейсе реализован отдельный </w:t>
+      </w:r>
+      <w:proofErr w:type="spellStart"/>
       <w:r>
         <w:rPr>
           <w:rFonts w:ascii="Times New Roman" w:eastAsia="Times New Roman" w:hAnsi="Times New Roman" w:cs="Times New Roman"/>
@@ -595,9 +569,9 @@
           <w:sz w:val="28"/>
           <w:lang w:val="ru-RU"/>
         </w:rPr>
-        <w:t xml:space="preserve">тображения ошибок в интерфейсе реализован отдельный </w:t>
-      </w:r>
-      <w:proofErr w:type="spellStart"/>
+        <w:t>маппер</w:t>
+      </w:r>
+      <w:proofErr w:type="spellEnd"/>
       <w:r>
         <w:rPr>
           <w:rFonts w:ascii="Times New Roman" w:eastAsia="Times New Roman" w:hAnsi="Times New Roman" w:cs="Times New Roman"/>
@@ -605,7 +579,17 @@
           <w:sz w:val="28"/>
           <w:lang w:val="ru-RU"/>
         </w:rPr>
-        <w:t>маппер</w:t>
+        <w:t xml:space="preserve"> </w:t>
+      </w:r>
+      <w:proofErr w:type="spellStart"/>
+      <w:r>
+        <w:rPr>
+          <w:rStyle w:val="VerbatimChar"/>
+          <w:rFonts w:ascii="Times New Roman" w:eastAsia="Times New Roman" w:hAnsi="Times New Roman" w:cs="Times New Roman"/>
+          <w:color w:val="000000"/>
+          <w:sz w:val="28"/>
+        </w:rPr>
+        <w:t>UiErrorMapper</w:t>
       </w:r>
       <w:proofErr w:type="spellEnd"/>
       <w:r>
@@ -615,7 +599,7 @@
           <w:sz w:val="28"/>
           <w:lang w:val="ru-RU"/>
         </w:rPr>
-        <w:t xml:space="preserve"> </w:t>
+        <w:t xml:space="preserve">, который преобразует исключения ядра в понятные пользовательские сообщения. Для проверки корректности реализации подготовлены автоматические тесты для классов </w:t>
       </w:r>
       <w:proofErr w:type="spellStart"/>
       <w:r>
@@ -625,7 +609,7 @@
           <w:color w:val="000000"/>
           <w:sz w:val="28"/>
         </w:rPr>
-        <w:t>UiErrorMapper</w:t>
+        <w:t>Abonent</w:t>
       </w:r>
       <w:proofErr w:type="spellEnd"/>
       <w:r>
@@ -635,7 +619,7 @@
           <w:sz w:val="28"/>
           <w:lang w:val="ru-RU"/>
         </w:rPr>
-        <w:t xml:space="preserve">, который преобразует исключения ядра в понятные пользовательские сообщения. Для проверки корректности реализации подготовлены автоматические тесты для классов </w:t>
+        <w:t xml:space="preserve">, </w:t>
       </w:r>
       <w:proofErr w:type="spellStart"/>
       <w:r>
@@ -645,7 +629,7 @@
           <w:color w:val="000000"/>
           <w:sz w:val="28"/>
         </w:rPr>
-        <w:t>Abonent</w:t>
+        <w:t>AbonentList</w:t>
       </w:r>
       <w:proofErr w:type="spellEnd"/>
       <w:r>
@@ -655,7 +639,7 @@
           <w:sz w:val="28"/>
           <w:lang w:val="ru-RU"/>
         </w:rPr>
-        <w:t xml:space="preserve">, </w:t>
+        <w:t xml:space="preserve"> и </w:t>
       </w:r>
       <w:proofErr w:type="spellStart"/>
       <w:r>
@@ -665,36 +649,7 @@
           <w:color w:val="000000"/>
           <w:sz w:val="28"/>
         </w:rPr>
-        <w:t>AbonentList</w:t>
-      </w:r>
-      <w:proofErr w:type="spellEnd"/>
-      <w:r>
-        <w:rPr>
-          <w:rFonts w:ascii="Times New Roman" w:eastAsia="Times New Roman" w:hAnsi="Times New Roman" w:cs="Times New Roman"/>
-          <w:color w:val="000000"/>
-          <w:sz w:val="28"/>
-          <w:lang w:val="ru-RU"/>
-        </w:rPr>
-        <w:t xml:space="preserve"> и </w:t>
-      </w:r>
-      <w:proofErr w:type="spellStart"/>
-      <w:r>
-        <w:rPr>
-          <w:rStyle w:val="VerbatimChar"/>
-          <w:rFonts w:ascii="Times New Roman" w:eastAsia="Times New Roman" w:hAnsi="Times New Roman" w:cs="Times New Roman"/>
-          <w:color w:val="000000"/>
-          <w:sz w:val="28"/>
-        </w:rPr>
-        <w:t>P</w:t>
-      </w:r>
-      <w:r>
-        <w:rPr>
-          <w:rStyle w:val="VerbatimChar"/>
-          <w:rFonts w:ascii="Times New Roman" w:eastAsia="Times New Roman" w:hAnsi="Times New Roman" w:cs="Times New Roman"/>
-          <w:color w:val="000000"/>
-          <w:sz w:val="28"/>
-        </w:rPr>
-        <w:t>honeBookControl</w:t>
+        <w:t>PhoneBookControl</w:t>
       </w:r>
       <w:proofErr w:type="spellEnd"/>
       <w:r>
@@ -814,7 +769,6 @@
           <w:sz w:val="28"/>
           <w:lang w:val="ru-RU"/>
         </w:rPr>
-        <w:lastRenderedPageBreak/>
         <w:t>Рис. 1. Диаграмма классов приложения «Телефонная книга»</w:t>
       </w:r>
     </w:p>
@@ -830,6 +784,7 @@
           <w:rFonts w:ascii="Times New Roman" w:eastAsia="Times New Roman" w:hAnsi="Times New Roman" w:cs="Times New Roman"/>
           <w:color w:val="000000"/>
         </w:rPr>
+        <w:lastRenderedPageBreak/>
         <w:t>4. Текст программы</w:t>
       </w:r>
     </w:p>
@@ -855,7 +810,11 @@
       </w:pPr>
       <w:r>
         <w:t>namespace PhoneBookLab2.Core;</w:t>
-        <w:br/>
+      </w:r>
+      <w:r>
+        <w:br/>
+      </w:r>
+      <w:r>
         <w:br/>
         <w:t>public readonly record struct AbonentRecord(string Name, string Number);</w:t>
       </w:r>
@@ -883,159 +842,334 @@
       </w:pPr>
       <w:r>
         <w:t>﻿namespace PhoneBookLab2.Core;</w:t>
-        <w:br/>
+      </w:r>
+      <w:r>
+        <w:br/>
+      </w:r>
+      <w:r>
         <w:br/>
         <w:t>public sealed class Abonent</w:t>
+      </w:r>
+      <w:r>
         <w:br/>
         <w:t>{</w:t>
+      </w:r>
+      <w:r>
         <w:br/>
         <w:t xml:space="preserve">    private AbonentRecord record;</w:t>
-        <w:br/>
+      </w:r>
+      <w:r>
+        <w:br/>
+      </w:r>
+      <w:r>
         <w:br/>
         <w:t xml:space="preserve">    public Abonent()</w:t>
+      </w:r>
+      <w:r>
         <w:br/>
         <w:t xml:space="preserve">    {</w:t>
+      </w:r>
+      <w:r>
         <w:br/>
         <w:t xml:space="preserve">        record = new AbonentRecord(string.Empty, string.Empty);</w:t>
+      </w:r>
+      <w:r>
         <w:br/>
         <w:t xml:space="preserve">    }</w:t>
-        <w:br/>
+      </w:r>
+      <w:r>
+        <w:br/>
+      </w:r>
+      <w:r>
         <w:br/>
         <w:t xml:space="preserve">    public Abonent(AbonentRecord record)</w:t>
+      </w:r>
+      <w:r>
         <w:br/>
         <w:t xml:space="preserve">    {</w:t>
+      </w:r>
+      <w:r>
         <w:br/>
         <w:t xml:space="preserve">        Write(record);</w:t>
+      </w:r>
+      <w:r>
         <w:br/>
         <w:t xml:space="preserve">    }</w:t>
-        <w:br/>
+      </w:r>
+      <w:r>
+        <w:br/>
+      </w:r>
+      <w:r>
         <w:br/>
         <w:t xml:space="preserve">    public string Name =&gt; record.Name;</w:t>
+      </w:r>
+      <w:r>
         <w:br/>
         <w:t xml:space="preserve">    public string Number =&gt; record.Number;</w:t>
-        <w:br/>
+      </w:r>
+      <w:r>
+        <w:br/>
+      </w:r>
+      <w:r>
         <w:br/>
         <w:t xml:space="preserve">    public AbonentRecord Read()</w:t>
+      </w:r>
+      <w:r>
         <w:br/>
         <w:t xml:space="preserve">    {</w:t>
+      </w:r>
+      <w:r>
         <w:br/>
         <w:t xml:space="preserve">        return record;</w:t>
+      </w:r>
+      <w:r>
         <w:br/>
         <w:t xml:space="preserve">    }</w:t>
-        <w:br/>
+      </w:r>
+      <w:r>
+        <w:br/>
+      </w:r>
+      <w:r>
         <w:br/>
         <w:t xml:space="preserve">    public void Write(AbonentRecord newRecord)</w:t>
+      </w:r>
+      <w:r>
         <w:br/>
         <w:t xml:space="preserve">    {</w:t>
+      </w:r>
+      <w:r>
         <w:br/>
         <w:t xml:space="preserve">        if (string.IsNullOrWhiteSpace(newRecord.Name))</w:t>
+      </w:r>
+      <w:r>
         <w:br/>
         <w:t xml:space="preserve">        {</w:t>
+      </w:r>
+      <w:r>
         <w:br/>
         <w:t xml:space="preserve">            throw new ArgumentException("Имя не должно быть пустым.", nameof(newRecord));</w:t>
+      </w:r>
+      <w:r>
         <w:br/>
         <w:t xml:space="preserve">        }</w:t>
-        <w:br/>
+      </w:r>
+      <w:r>
+        <w:br/>
+      </w:r>
+      <w:r>
         <w:br/>
         <w:t xml:space="preserve">        if (string.IsNullOrWhiteSpace(newRecord.Number))</w:t>
+      </w:r>
+      <w:r>
         <w:br/>
         <w:t xml:space="preserve">        {</w:t>
+      </w:r>
+      <w:r>
         <w:br/>
         <w:t xml:space="preserve">            throw new ArgumentException("Номер не должен быть пустым.", nameof(newRecord));</w:t>
+      </w:r>
+      <w:r>
         <w:br/>
         <w:t xml:space="preserve">        }</w:t>
-        <w:br/>
+      </w:r>
+      <w:r>
+        <w:br/>
+      </w:r>
+      <w:r>
         <w:br/>
         <w:t xml:space="preserve">        record = new AbonentRecord(newRecord.Name.Trim(), newRecord.Number.Trim());</w:t>
+      </w:r>
+      <w:r>
         <w:br/>
         <w:t xml:space="preserve">    }</w:t>
-        <w:br/>
+      </w:r>
+      <w:r>
+        <w:br/>
+      </w:r>
+      <w:r>
         <w:br/>
         <w:t xml:space="preserve">    public int Less(Abonent other)</w:t>
+      </w:r>
+      <w:r>
         <w:br/>
         <w:t xml:space="preserve">    {</w:t>
-        <w:br/>
+      </w:r>
+      <w:r>
+        <w:br/>
+      </w:r>
+      <w:r>
+        <w:lastRenderedPageBreak/>
         <w:t xml:space="preserve">        if (other is null)</w:t>
+      </w:r>
+      <w:r>
         <w:br/>
         <w:t xml:space="preserve">        {</w:t>
+      </w:r>
+      <w:r>
         <w:br/>
         <w:t xml:space="preserve">            throw new ArgumentNullException(nameof(other), "Сравниваемый абонент не должен быть null.");</w:t>
+      </w:r>
+      <w:r>
         <w:br/>
         <w:t xml:space="preserve">        }</w:t>
-        <w:br/>
+      </w:r>
+      <w:r>
+        <w:br/>
+      </w:r>
+      <w:r>
         <w:br/>
         <w:t xml:space="preserve">        var byName = string.Compare(Name, other.Name, StringComparison.OrdinalIgnoreCase);</w:t>
+      </w:r>
+      <w:r>
         <w:br/>
         <w:t xml:space="preserve">        if (byName &lt; 0)</w:t>
+      </w:r>
+      <w:r>
         <w:br/>
         <w:t xml:space="preserve">        {</w:t>
+      </w:r>
+      <w:r>
         <w:br/>
         <w:t xml:space="preserve">            return -1;</w:t>
+      </w:r>
+      <w:r>
         <w:br/>
         <w:t xml:space="preserve">        }</w:t>
-        <w:br/>
+      </w:r>
+      <w:r>
+        <w:br/>
+      </w:r>
+      <w:r>
         <w:br/>
         <w:t xml:space="preserve">        if (byName &gt; 0)</w:t>
+      </w:r>
+      <w:r>
         <w:br/>
         <w:t xml:space="preserve">        {</w:t>
+      </w:r>
+      <w:r>
         <w:br/>
         <w:t xml:space="preserve">            return 1;</w:t>
+      </w:r>
+      <w:r>
         <w:br/>
         <w:t xml:space="preserve">        }</w:t>
-        <w:br/>
+      </w:r>
+      <w:r>
+        <w:br/>
+      </w:r>
+      <w:r>
         <w:br/>
         <w:t xml:space="preserve">        var byNumber = string.Compare(Number, other.Number, StringComparison.OrdinalIgnoreCase);</w:t>
+      </w:r>
+      <w:r>
         <w:br/>
         <w:t xml:space="preserve">        if (byNumber &lt; 0)</w:t>
+      </w:r>
+      <w:r>
         <w:br/>
         <w:t xml:space="preserve">        {</w:t>
+      </w:r>
+      <w:r>
         <w:br/>
         <w:t xml:space="preserve">            return -1;</w:t>
+      </w:r>
+      <w:r>
         <w:br/>
         <w:t xml:space="preserve">        }</w:t>
-        <w:br/>
+      </w:r>
+      <w:r>
+        <w:br/>
+      </w:r>
+      <w:r>
         <w:br/>
         <w:t xml:space="preserve">        if (byNumber &gt; 0)</w:t>
+      </w:r>
+      <w:r>
         <w:br/>
         <w:t xml:space="preserve">        {</w:t>
+      </w:r>
+      <w:r>
         <w:br/>
         <w:t xml:space="preserve">            return 1;</w:t>
+      </w:r>
+      <w:r>
         <w:br/>
         <w:t xml:space="preserve">        }</w:t>
-        <w:br/>
+      </w:r>
+      <w:r>
+        <w:br/>
+      </w:r>
+      <w:r>
         <w:br/>
         <w:t xml:space="preserve">        return 0;</w:t>
+      </w:r>
+      <w:r>
         <w:br/>
         <w:t xml:space="preserve">    }</w:t>
-        <w:br/>
+      </w:r>
+      <w:r>
+        <w:br/>
+      </w:r>
+      <w:r>
         <w:br/>
         <w:t xml:space="preserve">    public bool EqualsRecord(Abonent other)</w:t>
+      </w:r>
+      <w:r>
         <w:br/>
         <w:t xml:space="preserve">    {</w:t>
+      </w:r>
+      <w:r>
         <w:br/>
         <w:t xml:space="preserve">        if (other is null)</w:t>
+      </w:r>
+      <w:r>
         <w:br/>
         <w:t xml:space="preserve">        {</w:t>
+      </w:r>
+      <w:r>
         <w:br/>
         <w:t xml:space="preserve">            throw new ArgumentNullException(nameof(other), "Сравниваемый абонент не должен быть null.");</w:t>
+      </w:r>
+      <w:r>
         <w:br/>
         <w:t xml:space="preserve">        }</w:t>
-        <w:br/>
+      </w:r>
+      <w:r>
+        <w:br/>
+      </w:r>
+      <w:r>
         <w:br/>
         <w:t xml:space="preserve">        return string.Equals(Name, other.Name, StringComparison.OrdinalIgnoreCase)</w:t>
+      </w:r>
+      <w:r>
         <w:br/>
         <w:t xml:space="preserve">            &amp;&amp; string.Equals(Number, other.Number, StringComparison.OrdinalIgnoreCase);</w:t>
+      </w:r>
+      <w:r>
         <w:br/>
         <w:t xml:space="preserve">    }</w:t>
-        <w:br/>
+      </w:r>
+      <w:r>
+        <w:br/>
+      </w:r>
+      <w:r>
         <w:br/>
         <w:t xml:space="preserve">    public override string ToString()</w:t>
+      </w:r>
+      <w:r>
         <w:br/>
         <w:t xml:space="preserve">    {</w:t>
+      </w:r>
+      <w:r>
         <w:br/>
         <w:t xml:space="preserve">        return $"{Name} | {Number}";</w:t>
+      </w:r>
+      <w:r>
         <w:br/>
         <w:t xml:space="preserve">    }</w:t>
+      </w:r>
+      <w:r>
         <w:br/>
         <w:t>}</w:t>
       </w:r>
@@ -1053,6 +1187,7 @@
           <w:rFonts w:ascii="Times New Roman" w:eastAsia="Times New Roman" w:hAnsi="Times New Roman" w:cs="Times New Roman"/>
           <w:color w:val="000000"/>
         </w:rPr>
+        <w:lastRenderedPageBreak/>
         <w:t>AbonentList.cs</w:t>
       </w:r>
     </w:p>
@@ -1063,182 +1198,384 @@
       </w:pPr>
       <w:r>
         <w:t>namespace PhoneBookLab2.Core;</w:t>
-        <w:br/>
+      </w:r>
+      <w:r>
+        <w:br/>
+      </w:r>
+      <w:r>
         <w:br/>
         <w:t>public sealed class AbonentList</w:t>
+      </w:r>
+      <w:r>
         <w:br/>
         <w:t>{</w:t>
+      </w:r>
+      <w:r>
         <w:br/>
         <w:t xml:space="preserve">    private readonly List&lt;Abonent&gt; items = new();</w:t>
-        <w:br/>
+      </w:r>
+      <w:r>
+        <w:br/>
+      </w:r>
+      <w:r>
         <w:br/>
         <w:t xml:space="preserve">    public int RecordsCount =&gt; items.Count;</w:t>
-        <w:br/>
+      </w:r>
+      <w:r>
+        <w:br/>
+      </w:r>
+      <w:r>
         <w:br/>
         <w:t xml:space="preserve">    public Abonent ReadRecord(int index)</w:t>
+      </w:r>
+      <w:r>
         <w:br/>
         <w:t xml:space="preserve">    {</w:t>
+      </w:r>
+      <w:r>
         <w:br/>
         <w:t xml:space="preserve">        if (index &lt; 0 || index &gt;= items.Count)</w:t>
+      </w:r>
+      <w:r>
         <w:br/>
         <w:t xml:space="preserve">        {</w:t>
+      </w:r>
+      <w:r>
         <w:br/>
         <w:t xml:space="preserve">            throw new ArgumentOutOfRangeException(nameof(index), "Индекс записи выходит за пределы списка.");</w:t>
+      </w:r>
+      <w:r>
         <w:br/>
         <w:t xml:space="preserve">        }</w:t>
-        <w:br/>
+      </w:r>
+      <w:r>
+        <w:br/>
+      </w:r>
+      <w:r>
         <w:br/>
         <w:t xml:space="preserve">        return items[index];</w:t>
+      </w:r>
+      <w:r>
         <w:br/>
         <w:t xml:space="preserve">    }</w:t>
-        <w:br/>
+      </w:r>
+      <w:r>
+        <w:br/>
+      </w:r>
+      <w:r>
         <w:br/>
         <w:t xml:space="preserve">    public void AddRecord(Abonent abonent)</w:t>
+      </w:r>
+      <w:r>
         <w:br/>
         <w:t xml:space="preserve">    {</w:t>
+      </w:r>
+      <w:r>
         <w:br/>
         <w:t xml:space="preserve">        if (abonent is null)</w:t>
+      </w:r>
+      <w:r>
         <w:br/>
         <w:t xml:space="preserve">        {</w:t>
+      </w:r>
+      <w:r>
         <w:br/>
         <w:t xml:space="preserve">            throw new ArgumentNullException(nameof(abonent), "Абонент не должен быть null.");</w:t>
+      </w:r>
+      <w:r>
         <w:br/>
         <w:t xml:space="preserve">        }</w:t>
-        <w:br/>
+      </w:r>
+      <w:r>
+        <w:br/>
+      </w:r>
+      <w:r>
         <w:br/>
         <w:t xml:space="preserve">        var insertIndex = items.FindIndex(x =&gt; x.Less(abonent) &gt; 0);</w:t>
+      </w:r>
+      <w:r>
         <w:br/>
         <w:t xml:space="preserve">        if (insertIndex &lt; 0)</w:t>
+      </w:r>
+      <w:r>
         <w:br/>
         <w:t xml:space="preserve">        {</w:t>
+      </w:r>
+      <w:r>
         <w:br/>
         <w:t xml:space="preserve">            items.Add(abonent);</w:t>
+      </w:r>
+      <w:r>
         <w:br/>
         <w:t xml:space="preserve">            return;</w:t>
+      </w:r>
+      <w:r>
         <w:br/>
         <w:t xml:space="preserve">        }</w:t>
-        <w:br/>
+      </w:r>
+      <w:r>
+        <w:br/>
+      </w:r>
+      <w:r>
         <w:br/>
         <w:t xml:space="preserve">        items.Insert(insertIndex, abonent);</w:t>
+      </w:r>
+      <w:r>
         <w:br/>
         <w:t xml:space="preserve">    }</w:t>
-        <w:br/>
+      </w:r>
+      <w:r>
+        <w:br/>
+      </w:r>
+      <w:r>
         <w:br/>
         <w:t xml:space="preserve">    public int FindRecord(Abonent abonent)</w:t>
+      </w:r>
+      <w:r>
         <w:br/>
         <w:t xml:space="preserve">    {</w:t>
+      </w:r>
+      <w:r>
         <w:br/>
         <w:t xml:space="preserve">        if (abonent is null)</w:t>
+      </w:r>
+      <w:r>
         <w:br/>
         <w:t xml:space="preserve">        {</w:t>
+      </w:r>
+      <w:r>
         <w:br/>
         <w:t xml:space="preserve">            throw new ArgumentNullException(nameof(abonent), "Абонент не должен быть null.");</w:t>
+      </w:r>
+      <w:r>
         <w:br/>
         <w:t xml:space="preserve">        }</w:t>
-        <w:br/>
+      </w:r>
+      <w:r>
+        <w:br/>
+      </w:r>
+      <w:r>
         <w:br/>
         <w:t xml:space="preserve">        for (var i = 0; i &lt; items.Count; i++)</w:t>
+      </w:r>
+      <w:r>
         <w:br/>
         <w:t xml:space="preserve">        {</w:t>
+      </w:r>
+      <w:r>
         <w:br/>
         <w:t xml:space="preserve">            if (items[i].EqualsRecord(abonent))</w:t>
+      </w:r>
+      <w:r>
         <w:br/>
         <w:t xml:space="preserve">            {</w:t>
+      </w:r>
+      <w:r>
         <w:br/>
         <w:t xml:space="preserve">                return i;</w:t>
+      </w:r>
+      <w:r>
         <w:br/>
         <w:t xml:space="preserve">            }</w:t>
-        <w:br/>
+      </w:r>
+      <w:r>
+        <w:br/>
+      </w:r>
+      <w:r>
+        <w:lastRenderedPageBreak/>
         <w:t xml:space="preserve">        }</w:t>
-        <w:br/>
+      </w:r>
+      <w:r>
+        <w:br/>
+      </w:r>
+      <w:r>
         <w:br/>
         <w:t xml:space="preserve">        return -1;</w:t>
+      </w:r>
+      <w:r>
         <w:br/>
         <w:t xml:space="preserve">    }</w:t>
-        <w:br/>
+      </w:r>
+      <w:r>
+        <w:br/>
+      </w:r>
+      <w:r>
         <w:br/>
         <w:t xml:space="preserve">    public bool RemoveRecord(Abonent abonent)</w:t>
+      </w:r>
+      <w:r>
         <w:br/>
         <w:t xml:space="preserve">    {</w:t>
+      </w:r>
+      <w:r>
         <w:br/>
         <w:t xml:space="preserve">        var index = FindRecord(abonent);</w:t>
+      </w:r>
+      <w:r>
         <w:br/>
         <w:t xml:space="preserve">        if (index &lt; 0)</w:t>
+      </w:r>
+      <w:r>
         <w:br/>
         <w:t xml:space="preserve">        {</w:t>
+      </w:r>
+      <w:r>
         <w:br/>
         <w:t xml:space="preserve">            return false;</w:t>
+      </w:r>
+      <w:r>
         <w:br/>
         <w:t xml:space="preserve">        }</w:t>
-        <w:br/>
+      </w:r>
+      <w:r>
+        <w:br/>
+      </w:r>
+      <w:r>
         <w:br/>
         <w:t xml:space="preserve">        items.RemoveAt(index);</w:t>
+      </w:r>
+      <w:r>
         <w:br/>
         <w:t xml:space="preserve">        return true;</w:t>
+      </w:r>
+      <w:r>
         <w:br/>
         <w:t xml:space="preserve">    }</w:t>
-        <w:br/>
+      </w:r>
+      <w:r>
+        <w:br/>
+      </w:r>
+      <w:r>
         <w:br/>
         <w:t xml:space="preserve">    public void RemoveSelectedRecord(int index)</w:t>
+      </w:r>
+      <w:r>
         <w:br/>
         <w:t xml:space="preserve">    {</w:t>
+      </w:r>
+      <w:r>
         <w:br/>
         <w:t xml:space="preserve">        if (index &lt; 0 || index &gt;= items.Count)</w:t>
+      </w:r>
+      <w:r>
         <w:br/>
         <w:t xml:space="preserve">        {</w:t>
+      </w:r>
+      <w:r>
         <w:br/>
         <w:t xml:space="preserve">            throw new ArgumentOutOfRangeException(nameof(index), "Индекс записи выходит за пределы списка.");</w:t>
+      </w:r>
+      <w:r>
         <w:br/>
         <w:t xml:space="preserve">        }</w:t>
-        <w:br/>
+      </w:r>
+      <w:r>
+        <w:br/>
+      </w:r>
+      <w:r>
         <w:br/>
         <w:t xml:space="preserve">        items.RemoveAt(index);</w:t>
+      </w:r>
+      <w:r>
         <w:br/>
         <w:t xml:space="preserve">    }</w:t>
-        <w:br/>
+      </w:r>
+      <w:r>
+        <w:br/>
+      </w:r>
+      <w:r>
         <w:br/>
         <w:t xml:space="preserve">    public void ClearList()</w:t>
+      </w:r>
+      <w:r>
         <w:br/>
         <w:t xml:space="preserve">    {</w:t>
+      </w:r>
+      <w:r>
         <w:br/>
         <w:t xml:space="preserve">        items.Clear();</w:t>
+      </w:r>
+      <w:r>
         <w:br/>
         <w:t xml:space="preserve">    }</w:t>
-        <w:br/>
+      </w:r>
+      <w:r>
+        <w:br/>
+      </w:r>
+      <w:r>
         <w:br/>
         <w:t xml:space="preserve">    public IReadOnlyList&lt;AbonentRecord&gt; Snapshot()</w:t>
+      </w:r>
+      <w:r>
         <w:br/>
         <w:t xml:space="preserve">    {</w:t>
+      </w:r>
+      <w:r>
         <w:br/>
         <w:t xml:space="preserve">        return items.Select(x =&gt; x.Read()).ToList();</w:t>
+      </w:r>
+      <w:r>
         <w:br/>
         <w:t xml:space="preserve">    }</w:t>
-        <w:br/>
+      </w:r>
+      <w:r>
+        <w:br/>
+      </w:r>
+      <w:r>
         <w:br/>
         <w:t xml:space="preserve">    public void ReplaceAll(IEnumerable&lt;AbonentRecord&gt; records)</w:t>
+      </w:r>
+      <w:r>
         <w:br/>
         <w:t xml:space="preserve">    {</w:t>
+      </w:r>
+      <w:r>
         <w:br/>
         <w:t xml:space="preserve">        if (records is null)</w:t>
+      </w:r>
+      <w:r>
         <w:br/>
         <w:t xml:space="preserve">        {</w:t>
+      </w:r>
+      <w:r>
         <w:br/>
         <w:t xml:space="preserve">            throw new ArgumentNullException(nameof(records), "Список записей не должен быть null.");</w:t>
+      </w:r>
+      <w:r>
         <w:br/>
         <w:t xml:space="preserve">        }</w:t>
-        <w:br/>
+      </w:r>
+      <w:r>
+        <w:br/>
+      </w:r>
+      <w:r>
         <w:br/>
         <w:t xml:space="preserve">        items.Clear();</w:t>
+      </w:r>
+      <w:r>
         <w:br/>
         <w:t xml:space="preserve">        foreach (var record in records)</w:t>
+      </w:r>
+      <w:r>
         <w:br/>
         <w:t xml:space="preserve">        {</w:t>
+      </w:r>
+      <w:r>
         <w:br/>
         <w:t xml:space="preserve">            AddRecord(new Abonent(record));</w:t>
+      </w:r>
+      <w:r>
         <w:br/>
         <w:t xml:space="preserve">        }</w:t>
-        <w:br/>
+      </w:r>
+      <w:r>
+        <w:br/>
+      </w:r>
+      <w:r>
+        <w:lastRenderedPageBreak/>
         <w:t xml:space="preserve">    }</w:t>
+      </w:r>
+      <w:r>
         <w:br/>
         <w:t>}</w:t>
       </w:r>
@@ -1266,235 +1603,495 @@
       </w:pPr>
       <w:r>
         <w:t>﻿using System.Text.Json;</w:t>
-        <w:br/>
+      </w:r>
+      <w:r>
+        <w:br/>
+      </w:r>
+      <w:r>
         <w:br/>
         <w:t>namespace PhoneBookLab2.Core;</w:t>
-        <w:br/>
+      </w:r>
+      <w:r>
+        <w:br/>
+      </w:r>
+      <w:r>
         <w:br/>
         <w:t>public sealed class PhoneBookControl : IDisposable</w:t>
+      </w:r>
+      <w:r>
         <w:br/>
         <w:t>{</w:t>
+      </w:r>
+      <w:r>
         <w:br/>
         <w:t xml:space="preserve">    private readonly AbonentList list = new();</w:t>
+      </w:r>
+      <w:r>
         <w:br/>
         <w:t xml:space="preserve">    private FileStream? fileStream;</w:t>
+      </w:r>
+      <w:r>
         <w:br/>
         <w:t xml:space="preserve">    private string? filePath;</w:t>
-        <w:br/>
+      </w:r>
+      <w:r>
+        <w:br/>
+      </w:r>
+      <w:r>
         <w:br/>
         <w:t xml:space="preserve">    public int RecordsInBook()</w:t>
+      </w:r>
+      <w:r>
         <w:br/>
         <w:t xml:space="preserve">    {</w:t>
+      </w:r>
+      <w:r>
         <w:br/>
         <w:t xml:space="preserve">        return list.RecordsCount;</w:t>
+      </w:r>
+      <w:r>
         <w:br/>
         <w:t xml:space="preserve">    }</w:t>
-        <w:br/>
+      </w:r>
+      <w:r>
+        <w:br/>
+      </w:r>
+      <w:r>
         <w:br/>
         <w:t xml:space="preserve">    public string ReadRecord(int index)</w:t>
+      </w:r>
+      <w:r>
         <w:br/>
         <w:t xml:space="preserve">    {</w:t>
+      </w:r>
+      <w:r>
         <w:br/>
         <w:t xml:space="preserve">        return list.ReadRecord(index).ToString();</w:t>
+      </w:r>
+      <w:r>
         <w:br/>
         <w:t xml:space="preserve">    }</w:t>
-        <w:br/>
+      </w:r>
+      <w:r>
+        <w:br/>
+      </w:r>
+      <w:r>
         <w:br/>
         <w:t xml:space="preserve">    public string ReadName(int index)</w:t>
+      </w:r>
+      <w:r>
         <w:br/>
         <w:t xml:space="preserve">    {</w:t>
+      </w:r>
+      <w:r>
         <w:br/>
         <w:t xml:space="preserve">        return list.ReadRecord(index).Name;</w:t>
+      </w:r>
+      <w:r>
         <w:br/>
         <w:t xml:space="preserve">    }</w:t>
-        <w:br/>
+      </w:r>
+      <w:r>
+        <w:br/>
+      </w:r>
+      <w:r>
         <w:br/>
         <w:t xml:space="preserve">    public string ReadNumber(int index)</w:t>
+      </w:r>
+      <w:r>
         <w:br/>
         <w:t xml:space="preserve">    {</w:t>
+      </w:r>
+      <w:r>
         <w:br/>
         <w:t xml:space="preserve">        return list.ReadRecord(index).Number;</w:t>
+      </w:r>
+      <w:r>
         <w:br/>
         <w:t xml:space="preserve">    }</w:t>
-        <w:br/>
+      </w:r>
+      <w:r>
+        <w:br/>
+      </w:r>
+      <w:r>
         <w:br/>
         <w:t xml:space="preserve">    public void AddRecord(string name, string number)</w:t>
+      </w:r>
+      <w:r>
         <w:br/>
         <w:t xml:space="preserve">    {</w:t>
+      </w:r>
+      <w:r>
         <w:br/>
         <w:t xml:space="preserve">        list.AddRecord(new Abonent(new AbonentRecord(name, number)));</w:t>
+      </w:r>
+      <w:r>
         <w:br/>
         <w:t xml:space="preserve">    }</w:t>
-        <w:br/>
+      </w:r>
+      <w:r>
+        <w:br/>
+      </w:r>
+      <w:r>
         <w:br/>
         <w:t xml:space="preserve">    public bool DeleteRecord(string name, string number)</w:t>
+      </w:r>
+      <w:r>
         <w:br/>
         <w:t xml:space="preserve">    {</w:t>
+      </w:r>
+      <w:r>
         <w:br/>
         <w:t xml:space="preserve">        return list.RemoveRecord(new Abonent(new AbonentRecord(name, number)));</w:t>
+      </w:r>
+      <w:r>
         <w:br/>
         <w:t xml:space="preserve">    }</w:t>
-        <w:br/>
+      </w:r>
+      <w:r>
+        <w:br/>
+      </w:r>
+      <w:r>
         <w:br/>
         <w:t xml:space="preserve">    public void DeleteSelectedRecord(int index)</w:t>
+      </w:r>
+      <w:r>
         <w:br/>
         <w:t xml:space="preserve">    {</w:t>
+      </w:r>
+      <w:r>
         <w:br/>
         <w:t xml:space="preserve">        list.RemoveSelectedRecord(index);</w:t>
+      </w:r>
+      <w:r>
         <w:br/>
         <w:t xml:space="preserve">    }</w:t>
-        <w:br/>
+      </w:r>
+      <w:r>
+        <w:br/>
+      </w:r>
+      <w:r>
         <w:br/>
         <w:t xml:space="preserve">    public void UpdateSelectedRecord(int index, string name, string number)</w:t>
+      </w:r>
+      <w:r>
         <w:br/>
         <w:t xml:space="preserve">    {</w:t>
+      </w:r>
+      <w:r>
         <w:br/>
         <w:t xml:space="preserve">        var updated = new Abonent(new AbonentRecord(name, number));</w:t>
-        <w:br/>
+      </w:r>
+      <w:r>
+        <w:br/>
+      </w:r>
+      <w:r>
+        <w:lastRenderedPageBreak/>
         <w:t xml:space="preserve">        list.RemoveSelectedRecord(index);</w:t>
+      </w:r>
+      <w:r>
         <w:br/>
         <w:t xml:space="preserve">        list.AddRecord(updated);</w:t>
+      </w:r>
+      <w:r>
         <w:br/>
         <w:t xml:space="preserve">    }</w:t>
-        <w:br/>
+      </w:r>
+      <w:r>
+        <w:br/>
+      </w:r>
+      <w:r>
         <w:br/>
         <w:t xml:space="preserve">    public void ClearBook()</w:t>
+      </w:r>
+      <w:r>
         <w:br/>
         <w:t xml:space="preserve">    {</w:t>
+      </w:r>
+      <w:r>
         <w:br/>
         <w:t xml:space="preserve">        list.ClearList();</w:t>
+      </w:r>
+      <w:r>
         <w:br/>
         <w:t xml:space="preserve">    }</w:t>
-        <w:br/>
+      </w:r>
+      <w:r>
+        <w:br/>
+      </w:r>
+      <w:r>
         <w:br/>
         <w:t xml:space="preserve">    public int FindRecord(string name, string number)</w:t>
+      </w:r>
+      <w:r>
         <w:br/>
         <w:t xml:space="preserve">    {</w:t>
+      </w:r>
+      <w:r>
         <w:br/>
         <w:t xml:space="preserve">        return list.FindRecord(new Abonent(new AbonentRecord(name, number)));</w:t>
+      </w:r>
+      <w:r>
         <w:br/>
         <w:t xml:space="preserve">    }</w:t>
-        <w:br/>
+      </w:r>
+      <w:r>
+        <w:br/>
+      </w:r>
+      <w:r>
         <w:br/>
         <w:t xml:space="preserve">    public void CreateFile(string path)</w:t>
+      </w:r>
+      <w:r>
         <w:br/>
         <w:t xml:space="preserve">    {</w:t>
+      </w:r>
+      <w:r>
         <w:br/>
         <w:t xml:space="preserve">        if (string.IsNullOrWhiteSpace(path))</w:t>
+      </w:r>
+      <w:r>
         <w:br/>
         <w:t xml:space="preserve">        {</w:t>
+      </w:r>
+      <w:r>
         <w:br/>
         <w:t xml:space="preserve">            throw new ArgumentException("Путь к файлу не должен быть пустым.", nameof(path));</w:t>
+      </w:r>
+      <w:r>
         <w:br/>
         <w:t xml:space="preserve">        }</w:t>
-        <w:br/>
+      </w:r>
+      <w:r>
+        <w:br/>
+      </w:r>
+      <w:r>
         <w:br/>
         <w:t xml:space="preserve">        DisposeStream();</w:t>
-        <w:br/>
+      </w:r>
+      <w:r>
+        <w:br/>
+      </w:r>
+      <w:r>
         <w:br/>
         <w:t xml:space="preserve">        filePath = path;</w:t>
+      </w:r>
+      <w:r>
         <w:br/>
         <w:t xml:space="preserve">        fileStream = new FileStream(path, FileMode.OpenOrCreate, FileAccess.ReadWrite, FileShare.Read);</w:t>
+      </w:r>
+      <w:r>
         <w:br/>
         <w:t xml:space="preserve">    }</w:t>
-        <w:br/>
+      </w:r>
+      <w:r>
+        <w:br/>
+      </w:r>
+      <w:r>
         <w:br/>
         <w:t xml:space="preserve">    public void SaveBookToFile()</w:t>
+      </w:r>
+      <w:r>
         <w:br/>
         <w:t xml:space="preserve">    {</w:t>
+      </w:r>
+      <w:r>
         <w:br/>
         <w:t xml:space="preserve">        EnsureFileCreated();</w:t>
-        <w:br/>
+      </w:r>
+      <w:r>
+        <w:br/>
+      </w:r>
+      <w:r>
         <w:br/>
         <w:t xml:space="preserve">        fileStream!.SetLength(0);</w:t>
+      </w:r>
+      <w:r>
         <w:br/>
         <w:t xml:space="preserve">        fileStream.Position = 0;</w:t>
-        <w:br/>
+      </w:r>
+      <w:r>
+        <w:br/>
+      </w:r>
+      <w:r>
         <w:br/>
         <w:t xml:space="preserve">        var records = list.Snapshot();</w:t>
+      </w:r>
+      <w:r>
         <w:br/>
         <w:t xml:space="preserve">        JsonSerializer.Serialize(fileStream, records);</w:t>
+      </w:r>
+      <w:r>
         <w:br/>
         <w:t xml:space="preserve">        fileStream.Flush();</w:t>
+      </w:r>
+      <w:r>
         <w:br/>
         <w:t xml:space="preserve">        fileStream.Position = 0;</w:t>
+      </w:r>
+      <w:r>
         <w:br/>
         <w:t xml:space="preserve">    }</w:t>
-        <w:br/>
+      </w:r>
+      <w:r>
+        <w:br/>
+      </w:r>
+      <w:r>
         <w:br/>
         <w:t xml:space="preserve">    public void LoadBookFromFile()</w:t>
+      </w:r>
+      <w:r>
         <w:br/>
         <w:t xml:space="preserve">    {</w:t>
+      </w:r>
+      <w:r>
         <w:br/>
         <w:t xml:space="preserve">        EnsureFileCreated();</w:t>
-        <w:br/>
+      </w:r>
+      <w:r>
+        <w:br/>
+      </w:r>
+      <w:r>
         <w:br/>
         <w:t xml:space="preserve">        fileStream!.Position = 0;</w:t>
+      </w:r>
+      <w:r>
         <w:br/>
         <w:t xml:space="preserve">        if (fileStream.Length == 0)</w:t>
+      </w:r>
+      <w:r>
         <w:br/>
         <w:t xml:space="preserve">        {</w:t>
+      </w:r>
+      <w:r>
         <w:br/>
         <w:t xml:space="preserve">            list.ClearList();</w:t>
+      </w:r>
+      <w:r>
         <w:br/>
         <w:t xml:space="preserve">            return;</w:t>
+      </w:r>
+      <w:r>
         <w:br/>
         <w:t xml:space="preserve">        }</w:t>
-        <w:br/>
+      </w:r>
+      <w:r>
+        <w:br/>
+      </w:r>
+      <w:r>
+        <w:lastRenderedPageBreak/>
         <w:br/>
         <w:t xml:space="preserve">        var records = JsonSerializer.Deserialize&lt;List&lt;AbonentRecord&gt;&gt;(fileStream);</w:t>
+      </w:r>
+      <w:r>
         <w:br/>
         <w:t xml:space="preserve">        list.ReplaceAll(records ?? []);</w:t>
+      </w:r>
+      <w:r>
         <w:br/>
         <w:t xml:space="preserve">        fileStream.Position = 0;</w:t>
+      </w:r>
+      <w:r>
         <w:br/>
         <w:t xml:space="preserve">    }</w:t>
-        <w:br/>
+      </w:r>
+      <w:r>
+        <w:br/>
+      </w:r>
+      <w:r>
         <w:br/>
         <w:t xml:space="preserve">    public string? CurrentFilePath()</w:t>
+      </w:r>
+      <w:r>
         <w:br/>
         <w:t xml:space="preserve">    {</w:t>
+      </w:r>
+      <w:r>
         <w:br/>
         <w:t xml:space="preserve">        return filePath;</w:t>
+      </w:r>
+      <w:r>
         <w:br/>
         <w:t xml:space="preserve">    }</w:t>
-        <w:br/>
+      </w:r>
+      <w:r>
+        <w:br/>
+      </w:r>
+      <w:r>
         <w:br/>
         <w:t xml:space="preserve">    public void Dispose()</w:t>
+      </w:r>
+      <w:r>
         <w:br/>
         <w:t xml:space="preserve">    {</w:t>
+      </w:r>
+      <w:r>
         <w:br/>
         <w:t xml:space="preserve">        DisposeStream();</w:t>
+      </w:r>
+      <w:r>
         <w:br/>
         <w:t xml:space="preserve">        GC.SuppressFinalize(this);</w:t>
+      </w:r>
+      <w:r>
         <w:br/>
         <w:t xml:space="preserve">    }</w:t>
-        <w:br/>
+      </w:r>
+      <w:r>
+        <w:br/>
+      </w:r>
+      <w:r>
         <w:br/>
         <w:t xml:space="preserve">    private void DisposeStream()</w:t>
+      </w:r>
+      <w:r>
         <w:br/>
         <w:t xml:space="preserve">    {</w:t>
+      </w:r>
+      <w:r>
         <w:br/>
         <w:t xml:space="preserve">        fileStream?.Dispose();</w:t>
+      </w:r>
+      <w:r>
         <w:br/>
         <w:t xml:space="preserve">        fileStream = null;</w:t>
+      </w:r>
+      <w:r>
         <w:br/>
         <w:t xml:space="preserve">    }</w:t>
-        <w:br/>
+      </w:r>
+      <w:r>
+        <w:br/>
+      </w:r>
+      <w:r>
         <w:br/>
         <w:t xml:space="preserve">    private void EnsureFileCreated()</w:t>
+      </w:r>
+      <w:r>
         <w:br/>
         <w:t xml:space="preserve">    {</w:t>
+      </w:r>
+      <w:r>
         <w:br/>
         <w:t xml:space="preserve">        if (fileStream is null)</w:t>
+      </w:r>
+      <w:r>
         <w:br/>
         <w:t xml:space="preserve">        {</w:t>
+      </w:r>
+      <w:r>
         <w:br/>
         <w:t xml:space="preserve">            throw new InvalidOperationException("Файл не создан и не открыт.");</w:t>
+      </w:r>
+      <w:r>
         <w:br/>
         <w:t xml:space="preserve">        }</w:t>
+      </w:r>
+      <w:r>
         <w:br/>
         <w:t xml:space="preserve">    }</w:t>
+      </w:r>
+      <w:r>
         <w:br/>
         <w:t>}</w:t>
       </w:r>
@@ -1525,50 +2122,121 @@
       </w:pPr>
       <w:r>
         <w:t>﻿using System.Text.Json;</w:t>
-        <w:br/>
+      </w:r>
+      <w:r>
+        <w:br/>
+      </w:r>
+      <w:r>
         <w:br/>
         <w:t>namespace PhoneBookLab2.WinForms;</w:t>
-        <w:br/>
+      </w:r>
+      <w:r>
+        <w:br/>
+      </w:r>
+      <w:r>
         <w:br/>
         <w:t>internal static class UiErrorMapper</w:t>
+      </w:r>
+      <w:r>
         <w:br/>
         <w:t>{</w:t>
+      </w:r>
+      <w:r>
         <w:br/>
         <w:t xml:space="preserve">    public static string ToUserMessage(Exception ex)</w:t>
+      </w:r>
+      <w:r>
         <w:br/>
         <w:t xml:space="preserve">    {</w:t>
+      </w:r>
+      <w:r>
         <w:br/>
         <w:t xml:space="preserve">        return ex switch</w:t>
+      </w:r>
+      <w:r>
         <w:br/>
         <w:t xml:space="preserve">        {</w:t>
+      </w:r>
+      <w:r>
         <w:br/>
         <w:t xml:space="preserve">            ArgumentException { ParamName: "path" } =&gt; "Укажите корректный путь к файлу телефонной книги.",</w:t>
+      </w:r>
+      <w:r>
         <w:br/>
         <w:t xml:space="preserve">            ArgumentException { ParamName: "newRecord" } =&gt; "Заполните имя и номер абонента.",</w:t>
-        <w:br/>
+      </w:r>
+      <w:r>
+        <w:br/>
+      </w:r>
+      <w:r>
         <w:br/>
         <w:t xml:space="preserve">            ArgumentNullException { ParamName: "other" } =&gt; "Не удалось выполнить сравнение записи. Повторите действие.",</w:t>
+      </w:r>
+      <w:r>
         <w:br/>
         <w:t xml:space="preserve">            ArgumentNullException { ParamName: "abonent" } =&gt; "Передана пустая запись абонента.",</w:t>
-        <w:br/>
+      </w:r>
+      <w:r>
+        <w:br/>
+      </w:r>
+      <w:r>
+        <w:lastRenderedPageBreak/>
         <w:t xml:space="preserve">            ArgumentNullException { ParamName: "records" } =&gt; "Список записей для загрузки пуст.",</w:t>
-        <w:br/>
+      </w:r>
+      <w:r>
+        <w:br/>
+      </w:r>
+      <w:r>
         <w:br/>
         <w:t xml:space="preserve">            ArgumentOutOfRangeException { ParamName: "index" } =&gt; "Выбрана некорректная запись.",</w:t>
+      </w:r>
+      <w:r>
         <w:br/>
         <w:t xml:space="preserve">            InvalidOperationException =&gt; "Сначала создайте новую книгу или откройте существующую.",</w:t>
+      </w:r>
+      <w:r>
         <w:br/>
         <w:t xml:space="preserve">            JsonException =&gt; "Файл книги имеет некорректный формат.",</w:t>
+      </w:r>
+      <w:r>
         <w:br/>
         <w:t xml:space="preserve">            UnauthorizedAccessException =&gt; "Недостаточно прав для доступа к файлу.",</w:t>
-        <w:br/>
-        <w:t xml:space="preserve">            IOException =&gt; "Не удалось выполнить операцию с файлом. Проверьте путь и доступ.",</w:t>
+      </w:r>
+      <w:r>
+        <w:br/>
+        <w:t xml:space="preserve">            IOException =&gt; "Не удалось выполнить операцию с файлом. </w:t>
+      </w:r>
+      <w:r>
+        <w:rPr>
+          <w:lang w:val="ru-RU"/>
+        </w:rPr>
+        <w:t>Проверьте путь и доступ.",</w:t>
+      </w:r>
+      <w:r>
+        <w:rPr>
+          <w:lang w:val="ru-RU"/>
+        </w:rPr>
         <w:br/>
         <w:t xml:space="preserve">            _ =&gt; "Произошла непредвиденная ошибка. Повторите действие."</w:t>
+      </w:r>
+      <w:r>
+        <w:rPr>
+          <w:lang w:val="ru-RU"/>
+        </w:rPr>
         <w:br/>
         <w:t xml:space="preserve">        };</w:t>
+      </w:r>
+      <w:r>
+        <w:rPr>
+          <w:lang w:val="ru-RU"/>
+        </w:rPr>
         <w:br/>
         <w:t xml:space="preserve">    }</w:t>
+      </w:r>
+      <w:r>
+        <w:rPr>
+          <w:lang w:val="ru-RU"/>
+        </w:rPr>
         <w:br/>
         <w:t>}</w:t>
       </w:r>
@@ -1616,752 +2284,1576 @@
       </w:pPr>
       <w:r>
         <w:t>﻿using PhoneBookLab2.Core;</w:t>
+      </w:r>
+      <w:r>
         <w:br/>
         <w:t>using System.Drawing;</w:t>
+      </w:r>
+      <w:r>
         <w:br/>
         <w:t>using System.IO;</w:t>
+      </w:r>
+      <w:r>
         <w:br/>
         <w:t>using System.Windows.Forms;</w:t>
-        <w:br/>
+      </w:r>
+      <w:r>
+        <w:br/>
+      </w:r>
+      <w:r>
         <w:br/>
         <w:t>namespace PhoneBookLab2.WinForms;</w:t>
-        <w:br/>
+      </w:r>
+      <w:r>
+        <w:br/>
+      </w:r>
+      <w:r>
         <w:br/>
         <w:t>public partial class Form1 : Form</w:t>
+      </w:r>
+      <w:r>
         <w:br/>
         <w:t>{</w:t>
+      </w:r>
+      <w:r>
         <w:br/>
         <w:t xml:space="preserve">    private const string HelpFileName = "help.txt";</w:t>
+      </w:r>
+      <w:r>
         <w:br/>
         <w:t xml:space="preserve">    private const string DefaultWindowTitle = "Телефонная книга";</w:t>
-        <w:br/>
+      </w:r>
+      <w:r>
+        <w:br/>
+      </w:r>
+      <w:r>
         <w:br/>
         <w:t xml:space="preserve">    private readonly PhoneBookControl control = new();</w:t>
-        <w:br/>
+      </w:r>
+      <w:r>
+        <w:br/>
+      </w:r>
+      <w:r>
         <w:br/>
         <w:t xml:space="preserve">    private readonly TextBox nameBox = new();</w:t>
+      </w:r>
+      <w:r>
         <w:br/>
         <w:t xml:space="preserve">    private readonly TextBox numberBox = new();</w:t>
+      </w:r>
+      <w:r>
         <w:br/>
         <w:t xml:space="preserve">    private readonly ListBox bookList = new();</w:t>
+      </w:r>
+      <w:r>
         <w:br/>
         <w:t xml:space="preserve">    private readonly Button addButton = new();</w:t>
+      </w:r>
+      <w:r>
         <w:br/>
         <w:t xml:space="preserve">    private readonly Button updateButton = new();</w:t>
+      </w:r>
+      <w:r>
         <w:br/>
         <w:t xml:space="preserve">    private readonly Button findButton = new();</w:t>
+      </w:r>
+      <w:r>
         <w:br/>
         <w:t xml:space="preserve">    private readonly Button removeSelectedButton = new();</w:t>
+      </w:r>
+      <w:r>
         <w:br/>
         <w:t xml:space="preserve">    private readonly Button removeByValueButton = new();</w:t>
+      </w:r>
+      <w:r>
         <w:br/>
         <w:t xml:space="preserve">    private readonly Button clearButton = new();</w:t>
+      </w:r>
+      <w:r>
         <w:br/>
         <w:t xml:space="preserve">    private readonly Button saveButton = new();</w:t>
-        <w:br/>
+      </w:r>
+      <w:r>
+        <w:br/>
+      </w:r>
+      <w:r>
         <w:br/>
         <w:t xml:space="preserve">    public Form1()</w:t>
+      </w:r>
+      <w:r>
         <w:br/>
         <w:t xml:space="preserve">    {</w:t>
+      </w:r>
+      <w:r>
         <w:br/>
         <w:t xml:space="preserve">        InitializeComponent();</w:t>
+      </w:r>
+      <w:r>
         <w:br/>
         <w:t xml:space="preserve">        BuildUi();</w:t>
+      </w:r>
+      <w:r>
         <w:br/>
         <w:t xml:space="preserve">        Load += (_, _) =&gt; UpdateList();</w:t>
+      </w:r>
+      <w:r>
         <w:br/>
         <w:t xml:space="preserve">        FormClosed += (_, _) =&gt; control.Dispose();</w:t>
+      </w:r>
+      <w:r>
         <w:br/>
         <w:t xml:space="preserve">    }</w:t>
-        <w:br/>
+      </w:r>
+      <w:r>
+        <w:br/>
+      </w:r>
+      <w:r>
         <w:br/>
         <w:t xml:space="preserve">    private void BuildUi()</w:t>
+      </w:r>
+      <w:r>
         <w:br/>
         <w:t xml:space="preserve">    {</w:t>
-        <w:br/>
+      </w:r>
+      <w:r>
+        <w:br/>
+      </w:r>
+      <w:r>
+        <w:lastRenderedPageBreak/>
         <w:t xml:space="preserve">        Text = DefaultWindowTitle;</w:t>
+      </w:r>
+      <w:r>
         <w:br/>
         <w:t xml:space="preserve">        StartPosition = FormStartPosition.CenterScreen;</w:t>
+      </w:r>
+      <w:r>
         <w:br/>
         <w:t xml:space="preserve">        MinimumSize = new Size(760, 520);</w:t>
-        <w:br/>
+      </w:r>
+      <w:r>
+        <w:br/>
+      </w:r>
+      <w:r>
         <w:br/>
         <w:t xml:space="preserve">        var menuStrip = new MenuStrip();</w:t>
+      </w:r>
+      <w:r>
         <w:br/>
         <w:t xml:space="preserve">        var helpMenu = new ToolStripMenuItem("Справка");</w:t>
+      </w:r>
+      <w:r>
         <w:br/>
         <w:t xml:space="preserve">        var aboutItem = new ToolStripMenuItem("О программе");</w:t>
+      </w:r>
+      <w:r>
         <w:br/>
         <w:t xml:space="preserve">        aboutItem.Click += (_, _) =&gt; ShowHelp();</w:t>
+      </w:r>
+      <w:r>
         <w:br/>
         <w:t xml:space="preserve">        helpMenu.DropDownItems.Add(aboutItem);</w:t>
+      </w:r>
+      <w:r>
         <w:br/>
         <w:t xml:space="preserve">        menuStrip.Items.Add(helpMenu);</w:t>
+      </w:r>
+      <w:r>
         <w:br/>
         <w:t xml:space="preserve">        MainMenuStrip = menuStrip;</w:t>
+      </w:r>
+      <w:r>
         <w:br/>
         <w:t xml:space="preserve">        Controls.Add(menuStrip);</w:t>
-        <w:br/>
+      </w:r>
+      <w:r>
+        <w:br/>
+      </w:r>
+      <w:r>
         <w:br/>
         <w:t xml:space="preserve">        var nameLabel = new Label { Text = "Имя", AutoSize = true, Location = new Point(15, 45) };</w:t>
+      </w:r>
+      <w:r>
         <w:br/>
         <w:t xml:space="preserve">        nameBox.SetBounds(60, 40, 220, 30);</w:t>
-        <w:br/>
+      </w:r>
+      <w:r>
+        <w:br/>
+      </w:r>
+      <w:r>
         <w:br/>
         <w:t xml:space="preserve">        var numberLabel = new Label { Text = "Номер", AutoSize = true, Location = new Point(300, 45) };</w:t>
+      </w:r>
+      <w:r>
         <w:br/>
         <w:t xml:space="preserve">        numberBox.SetBounds(360, 40, 180, 30);</w:t>
-        <w:br/>
+      </w:r>
+      <w:r>
+        <w:br/>
+      </w:r>
+      <w:r>
         <w:br/>
         <w:t xml:space="preserve">        ConfigureButton(addButton, "Добавить", 575, 38, OnAddClick);</w:t>
-        <w:br/>
+      </w:r>
+      <w:r>
+        <w:br/>
+      </w:r>
+      <w:r>
         <w:br/>
         <w:t xml:space="preserve">        ConfigureButton(updateButton, "Изменить", 15, 80, OnUpdateSelectedClick);</w:t>
+      </w:r>
+      <w:r>
         <w:br/>
         <w:t xml:space="preserve">        ConfigureButton(findButton, "Найти", 155, 80, OnFindClick);</w:t>
+      </w:r>
+      <w:r>
         <w:br/>
         <w:t xml:space="preserve">        ConfigureButton(removeSelectedButton, "Удалить выдел.", 295, 80, OnDeleteSelectedClick);</w:t>
+      </w:r>
+      <w:r>
         <w:br/>
         <w:t xml:space="preserve">        ConfigureButton(removeByValueButton, "Удалить по знач.", 435, 80, OnDeleteByValueClick);</w:t>
+      </w:r>
+      <w:r>
         <w:br/>
         <w:t xml:space="preserve">        ConfigureButton(clearButton, "Очистить", 575, 80, OnClearClick);</w:t>
-        <w:br/>
+      </w:r>
+      <w:r>
+        <w:br/>
+      </w:r>
+      <w:r>
         <w:br/>
         <w:t xml:space="preserve">        var newFileButton = CreateButton("Новая книга", 15, 120, OnNewFileClick);</w:t>
+      </w:r>
+      <w:r>
         <w:br/>
         <w:t xml:space="preserve">        var openButton = CreateButton("Открыть", 155, 120, OnOpenClick);</w:t>
+      </w:r>
+      <w:r>
         <w:br/>
         <w:t xml:space="preserve">        ConfigureButton(saveButton, "Сохранить", 295, 120, OnSaveClick);</w:t>
-        <w:br/>
+      </w:r>
+      <w:r>
+        <w:br/>
+      </w:r>
+      <w:r>
         <w:br/>
         <w:t xml:space="preserve">        bookList.SetBounds(15, 165, 690, 290);</w:t>
+      </w:r>
+      <w:r>
         <w:br/>
         <w:t xml:space="preserve">        bookList.Font = new Font("Consolas", 11f);</w:t>
+      </w:r>
+      <w:r>
         <w:br/>
         <w:t xml:space="preserve">        bookList.DoubleClick += (_, _) =&gt; OnDeleteSelectedClick(this, EventArgs.Empty);</w:t>
+      </w:r>
+      <w:r>
         <w:br/>
         <w:t xml:space="preserve">        bookList.SelectedIndexChanged += (_, _) =&gt; SyncSelectionToEditors();</w:t>
-        <w:br/>
+      </w:r>
+      <w:r>
+        <w:br/>
+      </w:r>
+      <w:r>
         <w:br/>
         <w:t xml:space="preserve">        Controls.Add(nameLabel);</w:t>
+      </w:r>
+      <w:r>
         <w:br/>
         <w:t xml:space="preserve">        Controls.Add(nameBox);</w:t>
+      </w:r>
+      <w:r>
         <w:br/>
         <w:t xml:space="preserve">        Controls.Add(numberLabel);</w:t>
+      </w:r>
+      <w:r>
         <w:br/>
         <w:t xml:space="preserve">        Controls.Add(numberBox);</w:t>
+      </w:r>
+      <w:r>
         <w:br/>
         <w:t xml:space="preserve">        Controls.Add(addButton);</w:t>
+      </w:r>
+      <w:r>
         <w:br/>
         <w:t xml:space="preserve">        Controls.Add(updateButton);</w:t>
+      </w:r>
+      <w:r>
         <w:br/>
         <w:t xml:space="preserve">        Controls.Add(removeByValueButton);</w:t>
+      </w:r>
+      <w:r>
         <w:br/>
         <w:t xml:space="preserve">        Controls.Add(removeSelectedButton);</w:t>
+      </w:r>
+      <w:r>
         <w:br/>
         <w:t xml:space="preserve">        Controls.Add(findButton);</w:t>
+      </w:r>
+      <w:r>
         <w:br/>
         <w:t xml:space="preserve">        Controls.Add(clearButton);</w:t>
+      </w:r>
+      <w:r>
         <w:br/>
         <w:t xml:space="preserve">        Controls.Add(newFileButton);</w:t>
+      </w:r>
+      <w:r>
         <w:br/>
         <w:t xml:space="preserve">        Controls.Add(openButton);</w:t>
-        <w:br/>
+      </w:r>
+      <w:r>
+        <w:br/>
+      </w:r>
+      <w:r>
+        <w:lastRenderedPageBreak/>
         <w:t xml:space="preserve">        Controls.Add(saveButton);</w:t>
+      </w:r>
+      <w:r>
         <w:br/>
         <w:t xml:space="preserve">        Controls.Add(bookList);</w:t>
-        <w:br/>
+      </w:r>
+      <w:r>
+        <w:br/>
+      </w:r>
+      <w:r>
         <w:br/>
         <w:t xml:space="preserve">        UpdateCommandState();</w:t>
+      </w:r>
+      <w:r>
         <w:br/>
         <w:t xml:space="preserve">    }</w:t>
-        <w:br/>
+      </w:r>
+      <w:r>
+        <w:br/>
+      </w:r>
+      <w:r>
         <w:br/>
         <w:t xml:space="preserve">    private Button CreateButton(string text, int x, int y, EventHandler onClick)</w:t>
+      </w:r>
+      <w:r>
         <w:br/>
         <w:t xml:space="preserve">    {</w:t>
+      </w:r>
+      <w:r>
         <w:br/>
         <w:t xml:space="preserve">        var button = new Button</w:t>
+      </w:r>
+      <w:r>
         <w:br/>
         <w:t xml:space="preserve">        {</w:t>
+      </w:r>
+      <w:r>
         <w:br/>
         <w:t xml:space="preserve">            Text = text,</w:t>
+      </w:r>
+      <w:r>
         <w:br/>
         <w:t xml:space="preserve">            Left = x,</w:t>
+      </w:r>
+      <w:r>
         <w:br/>
         <w:t xml:space="preserve">            Top = y,</w:t>
+      </w:r>
+      <w:r>
         <w:br/>
         <w:t xml:space="preserve">            Width = 130,</w:t>
+      </w:r>
+      <w:r>
         <w:br/>
         <w:t xml:space="preserve">            Height = 32</w:t>
+      </w:r>
+      <w:r>
         <w:br/>
         <w:t xml:space="preserve">        };</w:t>
+      </w:r>
+      <w:r>
         <w:br/>
         <w:t xml:space="preserve">        button.Click += onClick;</w:t>
+      </w:r>
+      <w:r>
         <w:br/>
         <w:t xml:space="preserve">        return button;</w:t>
+      </w:r>
+      <w:r>
         <w:br/>
         <w:t xml:space="preserve">    }</w:t>
-        <w:br/>
+      </w:r>
+      <w:r>
+        <w:br/>
+      </w:r>
+      <w:r>
         <w:br/>
         <w:t xml:space="preserve">    private static void ConfigureButton(Button button, string text, int x, int y, EventHandler onClick)</w:t>
+      </w:r>
+      <w:r>
         <w:br/>
         <w:t xml:space="preserve">    {</w:t>
+      </w:r>
+      <w:r>
         <w:br/>
         <w:t xml:space="preserve">        button.Text = text;</w:t>
+      </w:r>
+      <w:r>
         <w:br/>
         <w:t xml:space="preserve">        button.Left = x;</w:t>
+      </w:r>
+      <w:r>
         <w:br/>
         <w:t xml:space="preserve">        button.Top = y;</w:t>
+      </w:r>
+      <w:r>
         <w:br/>
         <w:t xml:space="preserve">        button.Width = 130;</w:t>
+      </w:r>
+      <w:r>
         <w:br/>
         <w:t xml:space="preserve">        button.Height = 32;</w:t>
+      </w:r>
+      <w:r>
         <w:br/>
         <w:t xml:space="preserve">        button.Click += onClick;</w:t>
+      </w:r>
+      <w:r>
         <w:br/>
         <w:t xml:space="preserve">    }</w:t>
-        <w:br/>
+      </w:r>
+      <w:r>
+        <w:br/>
+      </w:r>
+      <w:r>
         <w:br/>
         <w:t xml:space="preserve">    private void OnAddClick(object? sender, EventArgs e)</w:t>
+      </w:r>
+      <w:r>
         <w:br/>
         <w:t xml:space="preserve">    {</w:t>
+      </w:r>
+      <w:r>
         <w:br/>
         <w:t xml:space="preserve">        if (!HasOpenedBook())</w:t>
+      </w:r>
+      <w:r>
         <w:br/>
         <w:t xml:space="preserve">        {</w:t>
+      </w:r>
+      <w:r>
         <w:br/>
         <w:t xml:space="preserve">            MessageBox.Show("Сначала создайте новую книгу или откройте существующую.", "Информация", MessageBoxButtons.OK, MessageBoxIcon.Information);</w:t>
+      </w:r>
+      <w:r>
         <w:br/>
         <w:t xml:space="preserve">            return;</w:t>
+      </w:r>
+      <w:r>
         <w:br/>
         <w:t xml:space="preserve">        }</w:t>
-        <w:br/>
+      </w:r>
+      <w:r>
+        <w:br/>
+      </w:r>
+      <w:r>
         <w:br/>
         <w:t xml:space="preserve">        try</w:t>
+      </w:r>
+      <w:r>
         <w:br/>
         <w:t xml:space="preserve">        {</w:t>
+      </w:r>
+      <w:r>
         <w:br/>
         <w:t xml:space="preserve">            control.AddRecord(nameBox.Text, numberBox.Text);</w:t>
+      </w:r>
+      <w:r>
         <w:br/>
         <w:t xml:space="preserve">            bookList.ClearSelected();</w:t>
+      </w:r>
+      <w:r>
         <w:br/>
         <w:t xml:space="preserve">            UpdateList();</w:t>
+      </w:r>
+      <w:r>
         <w:br/>
         <w:t xml:space="preserve">            UpdateCommandState();</w:t>
+      </w:r>
+      <w:r>
         <w:br/>
         <w:t xml:space="preserve">        }</w:t>
+      </w:r>
+      <w:r>
         <w:br/>
         <w:t xml:space="preserve">        catch (Exception ex)</w:t>
+      </w:r>
+      <w:r>
         <w:br/>
         <w:t xml:space="preserve">        {</w:t>
+      </w:r>
+      <w:r>
         <w:br/>
         <w:t xml:space="preserve">            ShowMappedError(ex);</w:t>
+      </w:r>
+      <w:r>
         <w:br/>
         <w:t xml:space="preserve">        }</w:t>
-        <w:br/>
+      </w:r>
+      <w:r>
+        <w:br/>
+      </w:r>
+      <w:r>
+        <w:lastRenderedPageBreak/>
         <w:t xml:space="preserve">    }</w:t>
-        <w:br/>
+      </w:r>
+      <w:r>
+        <w:br/>
+      </w:r>
+      <w:r>
         <w:br/>
         <w:t xml:space="preserve">    private void OnUpdateSelectedClick(object? sender, EventArgs e)</w:t>
+      </w:r>
+      <w:r>
         <w:br/>
         <w:t xml:space="preserve">    {</w:t>
+      </w:r>
+      <w:r>
         <w:br/>
         <w:t xml:space="preserve">        if (bookList.SelectedIndex &lt; 0)</w:t>
+      </w:r>
+      <w:r>
         <w:br/>
         <w:t xml:space="preserve">        {</w:t>
+      </w:r>
+      <w:r>
         <w:br/>
         <w:t xml:space="preserve">            MessageBox.Show("Выберите запись для редактирования.", "Информация", MessageBoxButtons.OK, MessageBoxIcon.Information);</w:t>
+      </w:r>
+      <w:r>
         <w:br/>
         <w:t xml:space="preserve">            return;</w:t>
+      </w:r>
+      <w:r>
         <w:br/>
         <w:t xml:space="preserve">        }</w:t>
-        <w:br/>
+      </w:r>
+      <w:r>
+        <w:br/>
+      </w:r>
+      <w:r>
         <w:br/>
         <w:t xml:space="preserve">        if (!HasOpenedBook())</w:t>
+      </w:r>
+      <w:r>
         <w:br/>
         <w:t xml:space="preserve">        {</w:t>
+      </w:r>
+      <w:r>
         <w:br/>
         <w:t xml:space="preserve">            MessageBox.Show("Сначала создайте новую книгу или откройте существующую.", "Информация", MessageBoxButtons.OK, MessageBoxIcon.Information);</w:t>
+      </w:r>
+      <w:r>
         <w:br/>
         <w:t xml:space="preserve">            return;</w:t>
+      </w:r>
+      <w:r>
         <w:br/>
         <w:t xml:space="preserve">        }</w:t>
-        <w:br/>
+      </w:r>
+      <w:r>
+        <w:br/>
+      </w:r>
+      <w:r>
         <w:br/>
         <w:t xml:space="preserve">        try</w:t>
+      </w:r>
+      <w:r>
         <w:br/>
         <w:t xml:space="preserve">        {</w:t>
+      </w:r>
+      <w:r>
         <w:br/>
         <w:t xml:space="preserve">            control.UpdateSelectedRecord(bookList.SelectedIndex, nameBox.Text, numberBox.Text);</w:t>
+      </w:r>
+      <w:r>
         <w:br/>
         <w:t xml:space="preserve">            UpdateList();</w:t>
+      </w:r>
+      <w:r>
         <w:br/>
         <w:t xml:space="preserve">            SelectRecord(nameBox.Text, numberBox.Text);</w:t>
+      </w:r>
+      <w:r>
         <w:br/>
         <w:t xml:space="preserve">            UpdateCommandState();</w:t>
+      </w:r>
+      <w:r>
         <w:br/>
         <w:t xml:space="preserve">        }</w:t>
+      </w:r>
+      <w:r>
         <w:br/>
         <w:t xml:space="preserve">        catch (Exception ex)</w:t>
+      </w:r>
+      <w:r>
         <w:br/>
         <w:t xml:space="preserve">        {</w:t>
+      </w:r>
+      <w:r>
         <w:br/>
         <w:t xml:space="preserve">            ShowMappedError(ex);</w:t>
+      </w:r>
+      <w:r>
         <w:br/>
         <w:t xml:space="preserve">        }</w:t>
+      </w:r>
+      <w:r>
         <w:br/>
         <w:t xml:space="preserve">    }</w:t>
-        <w:br/>
+      </w:r>
+      <w:r>
+        <w:br/>
+      </w:r>
+      <w:r>
         <w:br/>
         <w:t xml:space="preserve">    private void OnDeleteByValueClick(object? sender, EventArgs e)</w:t>
+      </w:r>
+      <w:r>
         <w:br/>
         <w:t xml:space="preserve">    {</w:t>
+      </w:r>
+      <w:r>
         <w:br/>
         <w:t xml:space="preserve">        if (!HasOpenedBook())</w:t>
+      </w:r>
+      <w:r>
         <w:br/>
         <w:t xml:space="preserve">        {</w:t>
+      </w:r>
+      <w:r>
         <w:br/>
         <w:t xml:space="preserve">            MessageBox.Show("Сначала создайте новую книгу или откройте существующую.", "Информация", MessageBoxButtons.OK, MessageBoxIcon.Information);</w:t>
+      </w:r>
+      <w:r>
         <w:br/>
         <w:t xml:space="preserve">            return;</w:t>
+      </w:r>
+      <w:r>
         <w:br/>
         <w:t xml:space="preserve">        }</w:t>
-        <w:br/>
+      </w:r>
+      <w:r>
+        <w:br/>
+      </w:r>
+      <w:r>
         <w:br/>
         <w:t xml:space="preserve">        try</w:t>
+      </w:r>
+      <w:r>
         <w:br/>
         <w:t xml:space="preserve">        {</w:t>
+      </w:r>
+      <w:r>
         <w:br/>
         <w:t xml:space="preserve">            var removed = control.DeleteRecord(nameBox.Text, numberBox.Text);</w:t>
+      </w:r>
+      <w:r>
         <w:br/>
         <w:t xml:space="preserve">            if (!removed)</w:t>
+      </w:r>
+      <w:r>
         <w:br/>
         <w:t xml:space="preserve">            {</w:t>
+      </w:r>
+      <w:r>
         <w:br/>
         <w:t xml:space="preserve">                MessageBox.Show("Запись не найдена.", "Информация", MessageBoxButtons.OK, MessageBoxIcon.Information);</w:t>
+      </w:r>
+      <w:r>
         <w:br/>
         <w:t xml:space="preserve">            }</w:t>
-        <w:br/>
-        <w:br/>
+      </w:r>
+      <w:r>
+        <w:br/>
+      </w:r>
+      <w:r>
+        <w:br/>
+      </w:r>
+      <w:r>
+        <w:lastRenderedPageBreak/>
         <w:t xml:space="preserve">            bookList.ClearSelected();</w:t>
+      </w:r>
+      <w:r>
         <w:br/>
         <w:t xml:space="preserve">            UpdateList();</w:t>
+      </w:r>
+      <w:r>
         <w:br/>
         <w:t xml:space="preserve">            UpdateCommandState();</w:t>
+      </w:r>
+      <w:r>
         <w:br/>
         <w:t xml:space="preserve">        }</w:t>
+      </w:r>
+      <w:r>
         <w:br/>
         <w:t xml:space="preserve">        catch (Exception ex)</w:t>
+      </w:r>
+      <w:r>
         <w:br/>
         <w:t xml:space="preserve">        {</w:t>
+      </w:r>
+      <w:r>
         <w:br/>
         <w:t xml:space="preserve">            ShowMappedError(ex);</w:t>
+      </w:r>
+      <w:r>
         <w:br/>
         <w:t xml:space="preserve">        }</w:t>
+      </w:r>
+      <w:r>
         <w:br/>
         <w:t xml:space="preserve">    }</w:t>
-        <w:br/>
+      </w:r>
+      <w:r>
+        <w:br/>
+      </w:r>
+      <w:r>
         <w:br/>
         <w:t xml:space="preserve">    private void OnDeleteSelectedClick(object? sender, EventArgs e)</w:t>
+      </w:r>
+      <w:r>
         <w:br/>
         <w:t xml:space="preserve">    {</w:t>
+      </w:r>
+      <w:r>
         <w:br/>
         <w:t xml:space="preserve">        if (bookList.SelectedIndex &lt; 0)</w:t>
+      </w:r>
+      <w:r>
         <w:br/>
         <w:t xml:space="preserve">        {</w:t>
+      </w:r>
+      <w:r>
         <w:br/>
         <w:t xml:space="preserve">            return;</w:t>
+      </w:r>
+      <w:r>
         <w:br/>
         <w:t xml:space="preserve">        }</w:t>
-        <w:br/>
+      </w:r>
+      <w:r>
+        <w:br/>
+      </w:r>
+      <w:r>
         <w:br/>
         <w:t xml:space="preserve">        if (!HasOpenedBook())</w:t>
+      </w:r>
+      <w:r>
         <w:br/>
         <w:t xml:space="preserve">        {</w:t>
+      </w:r>
+      <w:r>
         <w:br/>
         <w:t xml:space="preserve">            MessageBox.Show("Сначала создайте новую книгу или откройте существующую.", "Информация", MessageBoxButtons.OK, MessageBoxIcon.Information);</w:t>
+      </w:r>
+      <w:r>
         <w:br/>
         <w:t xml:space="preserve">            return;</w:t>
+      </w:r>
+      <w:r>
         <w:br/>
         <w:t xml:space="preserve">        }</w:t>
-        <w:br/>
+      </w:r>
+      <w:r>
+        <w:br/>
+      </w:r>
+      <w:r>
         <w:br/>
         <w:t xml:space="preserve">        try</w:t>
+      </w:r>
+      <w:r>
         <w:br/>
         <w:t xml:space="preserve">        {</w:t>
+      </w:r>
+      <w:r>
         <w:br/>
         <w:t xml:space="preserve">            control.DeleteSelectedRecord(bookList.SelectedIndex);</w:t>
+      </w:r>
+      <w:r>
         <w:br/>
         <w:t xml:space="preserve">            bookList.ClearSelected();</w:t>
+      </w:r>
+      <w:r>
         <w:br/>
         <w:t xml:space="preserve">            UpdateList();</w:t>
+      </w:r>
+      <w:r>
         <w:br/>
         <w:t xml:space="preserve">            UpdateCommandState();</w:t>
+      </w:r>
+      <w:r>
         <w:br/>
         <w:t xml:space="preserve">        }</w:t>
+      </w:r>
+      <w:r>
         <w:br/>
         <w:t xml:space="preserve">        catch (Exception ex)</w:t>
+      </w:r>
+      <w:r>
         <w:br/>
         <w:t xml:space="preserve">        {</w:t>
+      </w:r>
+      <w:r>
         <w:br/>
         <w:t xml:space="preserve">            ShowMappedError(ex);</w:t>
+      </w:r>
+      <w:r>
         <w:br/>
         <w:t xml:space="preserve">        }</w:t>
+      </w:r>
+      <w:r>
         <w:br/>
         <w:t xml:space="preserve">    }</w:t>
-        <w:br/>
+      </w:r>
+      <w:r>
+        <w:br/>
+      </w:r>
+      <w:r>
         <w:br/>
         <w:t xml:space="preserve">    private void OnFindClick(object? sender, EventArgs e)</w:t>
+      </w:r>
+      <w:r>
         <w:br/>
         <w:t xml:space="preserve">    {</w:t>
+      </w:r>
+      <w:r>
         <w:br/>
         <w:t xml:space="preserve">        if (!HasOpenedBook())</w:t>
+      </w:r>
+      <w:r>
         <w:br/>
         <w:t xml:space="preserve">        {</w:t>
+      </w:r>
+      <w:r>
         <w:br/>
         <w:t xml:space="preserve">            MessageBox.Show("Сначала создайте новую книгу или откройте существующую.", "Информация", MessageBoxButtons.OK, MessageBoxIcon.Information);</w:t>
+      </w:r>
+      <w:r>
         <w:br/>
         <w:t xml:space="preserve">            return;</w:t>
+      </w:r>
+      <w:r>
         <w:br/>
         <w:t xml:space="preserve">        }</w:t>
-        <w:br/>
+      </w:r>
+      <w:r>
+        <w:br/>
+      </w:r>
+      <w:r>
         <w:br/>
         <w:t xml:space="preserve">        try</w:t>
+      </w:r>
+      <w:r>
         <w:br/>
         <w:t xml:space="preserve">        {</w:t>
+      </w:r>
+      <w:r>
         <w:br/>
         <w:t xml:space="preserve">            var index = control.FindRecord(nameBox.Text, numberBox.Text);</w:t>
+      </w:r>
+      <w:r>
         <w:br/>
         <w:t xml:space="preserve">            if (index &lt; 0)</w:t>
-        <w:br/>
+      </w:r>
+      <w:r>
+        <w:br/>
+      </w:r>
+      <w:r>
+        <w:lastRenderedPageBreak/>
         <w:t xml:space="preserve">            {</w:t>
+      </w:r>
+      <w:r>
         <w:br/>
         <w:t xml:space="preserve">                MessageBox.Show("Запись не найдена.", "Поиск", MessageBoxButtons.OK, MessageBoxIcon.Information);</w:t>
+      </w:r>
+      <w:r>
         <w:br/>
         <w:t xml:space="preserve">                return;</w:t>
+      </w:r>
+      <w:r>
         <w:br/>
         <w:t xml:space="preserve">            }</w:t>
-        <w:br/>
+      </w:r>
+      <w:r>
+        <w:br/>
+      </w:r>
+      <w:r>
         <w:br/>
         <w:t xml:space="preserve">            bookList.SelectedIndex = index;</w:t>
+      </w:r>
+      <w:r>
         <w:br/>
         <w:t xml:space="preserve">        }</w:t>
+      </w:r>
+      <w:r>
         <w:br/>
         <w:t xml:space="preserve">        catch (Exception ex)</w:t>
+      </w:r>
+      <w:r>
         <w:br/>
         <w:t xml:space="preserve">        {</w:t>
+      </w:r>
+      <w:r>
         <w:br/>
         <w:t xml:space="preserve">            ShowMappedError(ex);</w:t>
+      </w:r>
+      <w:r>
         <w:br/>
         <w:t xml:space="preserve">        }</w:t>
+      </w:r>
+      <w:r>
         <w:br/>
         <w:t xml:space="preserve">    }</w:t>
-        <w:br/>
+      </w:r>
+      <w:r>
+        <w:br/>
+      </w:r>
+      <w:r>
         <w:br/>
         <w:t xml:space="preserve">    private void OnClearClick(object? sender, EventArgs e)</w:t>
+      </w:r>
+      <w:r>
         <w:br/>
         <w:t xml:space="preserve">    {</w:t>
+      </w:r>
+      <w:r>
         <w:br/>
         <w:t xml:space="preserve">        if (!HasOpenedBook())</w:t>
+      </w:r>
+      <w:r>
         <w:br/>
         <w:t xml:space="preserve">        {</w:t>
+      </w:r>
+      <w:r>
         <w:br/>
         <w:t xml:space="preserve">            MessageBox.Show("Сначала создайте новую книгу или откройте существующую.", "Информация", MessageBoxButtons.OK, MessageBoxIcon.Information);</w:t>
+      </w:r>
+      <w:r>
         <w:br/>
         <w:t xml:space="preserve">            return;</w:t>
+      </w:r>
+      <w:r>
         <w:br/>
         <w:t xml:space="preserve">        }</w:t>
-        <w:br/>
+      </w:r>
+      <w:r>
+        <w:br/>
+      </w:r>
+      <w:r>
         <w:br/>
         <w:t xml:space="preserve">        control.ClearBook();</w:t>
+      </w:r>
+      <w:r>
         <w:br/>
         <w:t xml:space="preserve">        bookList.ClearSelected();</w:t>
+      </w:r>
+      <w:r>
         <w:br/>
         <w:t xml:space="preserve">        UpdateList();</w:t>
+      </w:r>
+      <w:r>
         <w:br/>
         <w:t xml:space="preserve">        UpdateCommandState();</w:t>
+      </w:r>
+      <w:r>
         <w:br/>
         <w:t xml:space="preserve">    }</w:t>
-        <w:br/>
+      </w:r>
+      <w:r>
+        <w:br/>
+      </w:r>
+      <w:r>
         <w:br/>
         <w:t xml:space="preserve">    private void OnNewFileClick(object? sender, EventArgs e)</w:t>
+      </w:r>
+      <w:r>
         <w:br/>
         <w:t xml:space="preserve">    {</w:t>
+      </w:r>
+      <w:r>
         <w:br/>
         <w:t xml:space="preserve">        using var dialog = new SaveFileDialog();</w:t>
+      </w:r>
+      <w:r>
         <w:br/>
         <w:t xml:space="preserve">        dialog.Filter = "Phone book (*.pbk)|*.pbk|All files (*.*)|*.*";</w:t>
+      </w:r>
+      <w:r>
         <w:br/>
         <w:t xml:space="preserve">        if (dialog.ShowDialog(this) != DialogResult.OK)</w:t>
+      </w:r>
+      <w:r>
         <w:br/>
         <w:t xml:space="preserve">        {</w:t>
+      </w:r>
+      <w:r>
         <w:br/>
         <w:t xml:space="preserve">            return;</w:t>
+      </w:r>
+      <w:r>
         <w:br/>
         <w:t xml:space="preserve">        }</w:t>
-        <w:br/>
+      </w:r>
+      <w:r>
+        <w:br/>
+      </w:r>
+      <w:r>
         <w:br/>
         <w:t xml:space="preserve">        control.CreateFile(dialog.FileName);</w:t>
+      </w:r>
+      <w:r>
         <w:br/>
         <w:t xml:space="preserve">        control.ClearBook();</w:t>
+      </w:r>
+      <w:r>
         <w:br/>
         <w:t xml:space="preserve">        control.SaveBookToFile();</w:t>
+      </w:r>
+      <w:r>
         <w:br/>
         <w:t xml:space="preserve">        bookList.ClearSelected();</w:t>
+      </w:r>
+      <w:r>
         <w:br/>
         <w:t xml:space="preserve">        UpdateList();</w:t>
+      </w:r>
+      <w:r>
         <w:br/>
         <w:t xml:space="preserve">        UpdateCommandState();</w:t>
+      </w:r>
+      <w:r>
         <w:br/>
         <w:t xml:space="preserve">    }</w:t>
-        <w:br/>
+      </w:r>
+      <w:r>
+        <w:br/>
+      </w:r>
+      <w:r>
         <w:br/>
         <w:t xml:space="preserve">    private void OnOpenClick(object? sender, EventArgs e)</w:t>
+      </w:r>
+      <w:r>
         <w:br/>
         <w:t xml:space="preserve">    {</w:t>
+      </w:r>
+      <w:r>
         <w:br/>
         <w:t xml:space="preserve">        using var dialog = new OpenFileDialog();</w:t>
+      </w:r>
+      <w:r>
         <w:br/>
         <w:t xml:space="preserve">        dialog.Filter = "Phone book (*.pbk)|*.pbk|All files (*.*)|*.*";</w:t>
+      </w:r>
+      <w:r>
         <w:br/>
         <w:t xml:space="preserve">        if (dialog.ShowDialog(this) != DialogResult.OK)</w:t>
-        <w:br/>
+      </w:r>
+      <w:r>
+        <w:br/>
+      </w:r>
+      <w:r>
+        <w:lastRenderedPageBreak/>
         <w:t xml:space="preserve">        {</w:t>
+      </w:r>
+      <w:r>
         <w:br/>
         <w:t xml:space="preserve">            return;</w:t>
+      </w:r>
+      <w:r>
         <w:br/>
         <w:t xml:space="preserve">        }</w:t>
-        <w:br/>
+      </w:r>
+      <w:r>
+        <w:br/>
+      </w:r>
+      <w:r>
         <w:br/>
         <w:t xml:space="preserve">        try</w:t>
+      </w:r>
+      <w:r>
         <w:br/>
         <w:t xml:space="preserve">        {</w:t>
+      </w:r>
+      <w:r>
         <w:br/>
         <w:t xml:space="preserve">            control.CreateFile(dialog.FileName);</w:t>
+      </w:r>
+      <w:r>
         <w:br/>
         <w:t xml:space="preserve">            control.LoadBookFromFile();</w:t>
+      </w:r>
+      <w:r>
         <w:br/>
         <w:t xml:space="preserve">            bookList.ClearSelected();</w:t>
+      </w:r>
+      <w:r>
         <w:br/>
         <w:t xml:space="preserve">            UpdateList();</w:t>
+      </w:r>
+      <w:r>
         <w:br/>
         <w:t xml:space="preserve">            UpdateCommandState();</w:t>
+      </w:r>
+      <w:r>
         <w:br/>
         <w:t xml:space="preserve">        }</w:t>
+      </w:r>
+      <w:r>
         <w:br/>
         <w:t xml:space="preserve">        catch (Exception ex)</w:t>
+      </w:r>
+      <w:r>
         <w:br/>
         <w:t xml:space="preserve">        {</w:t>
+      </w:r>
+      <w:r>
         <w:br/>
         <w:t xml:space="preserve">            ShowMappedError(ex);</w:t>
+      </w:r>
+      <w:r>
         <w:br/>
         <w:t xml:space="preserve">        }</w:t>
+      </w:r>
+      <w:r>
         <w:br/>
         <w:t xml:space="preserve">    }</w:t>
-        <w:br/>
+      </w:r>
+      <w:r>
+        <w:br/>
+      </w:r>
+      <w:r>
         <w:br/>
         <w:t xml:space="preserve">    private void OnSaveClick(object? sender, EventArgs e)</w:t>
+      </w:r>
+      <w:r>
         <w:br/>
         <w:t xml:space="preserve">    {</w:t>
+      </w:r>
+      <w:r>
         <w:br/>
         <w:t xml:space="preserve">        if (!HasOpenedBook())</w:t>
+      </w:r>
+      <w:r>
         <w:br/>
         <w:t xml:space="preserve">        {</w:t>
+      </w:r>
+      <w:r>
         <w:br/>
         <w:t xml:space="preserve">            MessageBox.Show("Сначала создайте новую книгу или откройте существующую.", "Информация", MessageBoxButtons.OK, MessageBoxIcon.Information);</w:t>
+      </w:r>
+      <w:r>
         <w:br/>
         <w:t xml:space="preserve">            return;</w:t>
+      </w:r>
+      <w:r>
         <w:br/>
         <w:t xml:space="preserve">        }</w:t>
-        <w:br/>
+      </w:r>
+      <w:r>
+        <w:br/>
+      </w:r>
+      <w:r>
         <w:br/>
         <w:t xml:space="preserve">        try</w:t>
+      </w:r>
+      <w:r>
         <w:br/>
         <w:t xml:space="preserve">        {</w:t>
+      </w:r>
+      <w:r>
         <w:br/>
         <w:t xml:space="preserve">            control.SaveBookToFile();</w:t>
+      </w:r>
+      <w:r>
         <w:br/>
         <w:t xml:space="preserve">        }</w:t>
+      </w:r>
+      <w:r>
         <w:br/>
         <w:t xml:space="preserve">        catch (Exception ex)</w:t>
+      </w:r>
+      <w:r>
         <w:br/>
         <w:t xml:space="preserve">        {</w:t>
+      </w:r>
+      <w:r>
         <w:br/>
         <w:t xml:space="preserve">            ShowMappedError(ex);</w:t>
+      </w:r>
+      <w:r>
         <w:br/>
         <w:t xml:space="preserve">        }</w:t>
+      </w:r>
+      <w:r>
         <w:br/>
         <w:t xml:space="preserve">    }</w:t>
-        <w:br/>
+      </w:r>
+      <w:r>
+        <w:br/>
+      </w:r>
+      <w:r>
         <w:br/>
         <w:t xml:space="preserve">    private void UpdateList()</w:t>
+      </w:r>
+      <w:r>
         <w:br/>
         <w:t xml:space="preserve">    {</w:t>
+      </w:r>
+      <w:r>
         <w:br/>
         <w:t xml:space="preserve">        bookList.Items.Clear();</w:t>
+      </w:r>
+      <w:r>
         <w:br/>
         <w:t xml:space="preserve">        for (var i = 0; i &lt; control.RecordsInBook(); i++)</w:t>
+      </w:r>
+      <w:r>
         <w:br/>
         <w:t xml:space="preserve">        {</w:t>
+      </w:r>
+      <w:r>
         <w:br/>
         <w:t xml:space="preserve">            bookList.Items.Add(control.ReadRecord(i));</w:t>
+      </w:r>
+      <w:r>
         <w:br/>
         <w:t xml:space="preserve">        }</w:t>
+      </w:r>
+      <w:r>
         <w:br/>
         <w:t xml:space="preserve">    }</w:t>
-        <w:br/>
+      </w:r>
+      <w:r>
+        <w:br/>
+      </w:r>
+      <w:r>
         <w:br/>
         <w:t xml:space="preserve">    private void SelectRecord(string name, string number)</w:t>
+      </w:r>
+      <w:r>
         <w:br/>
         <w:t xml:space="preserve">    {</w:t>
+      </w:r>
+      <w:r>
         <w:br/>
         <w:t xml:space="preserve">        var index = control.FindRecord(name, number);</w:t>
+      </w:r>
+      <w:r>
         <w:br/>
         <w:t xml:space="preserve">        if (index &gt;= 0)</w:t>
+      </w:r>
+      <w:r>
         <w:br/>
         <w:t xml:space="preserve">        {</w:t>
-        <w:br/>
+      </w:r>
+      <w:r>
+        <w:br/>
+      </w:r>
+      <w:r>
+        <w:lastRenderedPageBreak/>
         <w:t xml:space="preserve">            bookList.SelectedIndex = index;</w:t>
+      </w:r>
+      <w:r>
         <w:br/>
         <w:t xml:space="preserve">        }</w:t>
+      </w:r>
+      <w:r>
         <w:br/>
         <w:t xml:space="preserve">    }</w:t>
-        <w:br/>
+      </w:r>
+      <w:r>
+        <w:br/>
+      </w:r>
+      <w:r>
         <w:br/>
         <w:t xml:space="preserve">    private void SyncSelectionToEditors()</w:t>
+      </w:r>
+      <w:r>
         <w:br/>
         <w:t xml:space="preserve">    {</w:t>
+      </w:r>
+      <w:r>
         <w:br/>
         <w:t xml:space="preserve">        if (bookList.SelectedIndex &lt; 0)</w:t>
+      </w:r>
+      <w:r>
         <w:br/>
         <w:t xml:space="preserve">        {</w:t>
+      </w:r>
+      <w:r>
         <w:br/>
         <w:t xml:space="preserve">            UpdateCommandState();</w:t>
+      </w:r>
+      <w:r>
         <w:br/>
         <w:t xml:space="preserve">            return;</w:t>
+      </w:r>
+      <w:r>
         <w:br/>
         <w:t xml:space="preserve">        }</w:t>
-        <w:br/>
+      </w:r>
+      <w:r>
+        <w:br/>
+      </w:r>
+      <w:r>
         <w:br/>
         <w:t xml:space="preserve">        nameBox.Text = control.ReadName(bookList.SelectedIndex);</w:t>
+      </w:r>
+      <w:r>
         <w:br/>
         <w:t xml:space="preserve">        numberBox.Text = control.ReadNumber(bookList.SelectedIndex);</w:t>
+      </w:r>
+      <w:r>
         <w:br/>
         <w:t xml:space="preserve">        UpdateCommandState();</w:t>
+      </w:r>
+      <w:r>
         <w:br/>
         <w:t xml:space="preserve">    }</w:t>
-        <w:br/>
+      </w:r>
+      <w:r>
+        <w:br/>
+      </w:r>
+      <w:r>
         <w:br/>
         <w:t xml:space="preserve">    private void ShowHelp()</w:t>
+      </w:r>
+      <w:r>
         <w:br/>
         <w:t xml:space="preserve">    {</w:t>
+      </w:r>
+      <w:r>
         <w:br/>
         <w:t xml:space="preserve">        try</w:t>
+      </w:r>
+      <w:r>
         <w:br/>
         <w:t xml:space="preserve">        {</w:t>
+      </w:r>
+      <w:r>
         <w:br/>
         <w:t xml:space="preserve">            var path = Path.Combine(AppContext.BaseDirectory, HelpFileName);</w:t>
+      </w:r>
+      <w:r>
         <w:br/>
         <w:t xml:space="preserve">            if (!File.Exists(path))</w:t>
+      </w:r>
+      <w:r>
         <w:br/>
         <w:t xml:space="preserve">            {</w:t>
+      </w:r>
+      <w:r>
         <w:br/>
         <w:t xml:space="preserve">                MessageBox.Show($"Файл справки не найден: {path}", "Справка", MessageBoxButtons.OK, MessageBoxIcon.Warning);</w:t>
+      </w:r>
+      <w:r>
         <w:br/>
         <w:t xml:space="preserve">                return;</w:t>
+      </w:r>
+      <w:r>
         <w:br/>
         <w:t xml:space="preserve">            }</w:t>
-        <w:br/>
+      </w:r>
+      <w:r>
+        <w:br/>
+      </w:r>
+      <w:r>
         <w:br/>
         <w:t xml:space="preserve">            var text = File.ReadAllText(path);</w:t>
+      </w:r>
+      <w:r>
         <w:br/>
         <w:t xml:space="preserve">            MessageBox.Show(text, "Справка", MessageBoxButtons.OK, MessageBoxIcon.Information);</w:t>
+      </w:r>
+      <w:r>
         <w:br/>
         <w:t xml:space="preserve">        }</w:t>
+      </w:r>
+      <w:r>
         <w:br/>
         <w:t xml:space="preserve">        catch (Exception ex)</w:t>
+      </w:r>
+      <w:r>
         <w:br/>
         <w:t xml:space="preserve">        {</w:t>
+      </w:r>
+      <w:r>
         <w:br/>
         <w:t xml:space="preserve">            ShowMappedError(ex, "Справка");</w:t>
+      </w:r>
+      <w:r>
         <w:br/>
         <w:t xml:space="preserve">        }</w:t>
+      </w:r>
+      <w:r>
         <w:br/>
         <w:t xml:space="preserve">    }</w:t>
-        <w:br/>
+      </w:r>
+      <w:r>
+        <w:br/>
+      </w:r>
+      <w:r>
         <w:br/>
         <w:t xml:space="preserve">    private static void ShowMappedError(Exception ex, string title = "Ошибка")</w:t>
+      </w:r>
+      <w:r>
         <w:br/>
         <w:t xml:space="preserve">    {</w:t>
+      </w:r>
+      <w:r>
         <w:br/>
         <w:t xml:space="preserve">        MessageBox.Show(UiErrorMapper.ToUserMessage(ex), title, MessageBoxButtons.OK, MessageBoxIcon.Warning);</w:t>
+      </w:r>
+      <w:r>
         <w:br/>
         <w:t xml:space="preserve">    }</w:t>
-        <w:br/>
+      </w:r>
+      <w:r>
+        <w:br/>
+      </w:r>
+      <w:r>
         <w:br/>
         <w:t xml:space="preserve">    private bool HasOpenedBook()</w:t>
+      </w:r>
+      <w:r>
         <w:br/>
         <w:t xml:space="preserve">    {</w:t>
+      </w:r>
+      <w:r>
         <w:br/>
         <w:t xml:space="preserve">        return !string.IsNullOrWhiteSpace(control.CurrentFilePath());</w:t>
+      </w:r>
+      <w:r>
         <w:br/>
         <w:t xml:space="preserve">    }</w:t>
-        <w:br/>
+      </w:r>
+      <w:r>
+        <w:br/>
+      </w:r>
+      <w:r>
         <w:br/>
         <w:t xml:space="preserve">    private void UpdateCommandState()</w:t>
+      </w:r>
+      <w:r>
         <w:br/>
         <w:t xml:space="preserve">    {</w:t>
-        <w:br/>
+      </w:r>
+      <w:r>
+        <w:br/>
+      </w:r>
+      <w:r>
+        <w:lastRenderedPageBreak/>
         <w:t xml:space="preserve">        var hasOpenedBook = HasOpenedBook();</w:t>
+      </w:r>
+      <w:r>
         <w:br/>
         <w:t xml:space="preserve">        nameBox.Enabled = hasOpenedBook;</w:t>
+      </w:r>
+      <w:r>
         <w:br/>
         <w:t xml:space="preserve">        numberBox.Enabled = hasOpenedBook;</w:t>
+      </w:r>
+      <w:r>
         <w:br/>
         <w:t xml:space="preserve">        addButton.Enabled = hasOpenedBook;</w:t>
+      </w:r>
+      <w:r>
         <w:br/>
         <w:t xml:space="preserve">        findButton.Enabled = hasOpenedBook;</w:t>
+      </w:r>
+      <w:r>
         <w:br/>
         <w:t xml:space="preserve">        removeByValueButton.Enabled = hasOpenedBook;</w:t>
+      </w:r>
+      <w:r>
         <w:br/>
         <w:t xml:space="preserve">        clearButton.Enabled = hasOpenedBook;</w:t>
+      </w:r>
+      <w:r>
         <w:br/>
         <w:t xml:space="preserve">        saveButton.Enabled = hasOpenedBook;</w:t>
-        <w:br/>
+      </w:r>
+      <w:r>
+        <w:br/>
+      </w:r>
+      <w:r>
         <w:br/>
         <w:t xml:space="preserve">        var hasSelection = hasOpenedBook &amp;&amp; bookList.SelectedIndex &gt;= 0;</w:t>
+      </w:r>
+      <w:r>
         <w:br/>
         <w:t xml:space="preserve">        updateButton.Enabled = hasSelection;</w:t>
+      </w:r>
+      <w:r>
         <w:br/>
         <w:t xml:space="preserve">        removeSelectedButton.Enabled = hasSelection;</w:t>
-        <w:br/>
+      </w:r>
+      <w:r>
+        <w:br/>
+      </w:r>
+      <w:r>
         <w:br/>
         <w:t xml:space="preserve">        UpdateWindowTitle();</w:t>
+      </w:r>
+      <w:r>
         <w:br/>
         <w:t xml:space="preserve">    }</w:t>
-        <w:br/>
+      </w:r>
+      <w:r>
+        <w:br/>
+      </w:r>
+      <w:r>
         <w:br/>
         <w:t xml:space="preserve">    private void UpdateWindowTitle()</w:t>
+      </w:r>
+      <w:r>
         <w:br/>
         <w:t xml:space="preserve">    {</w:t>
+      </w:r>
+      <w:r>
         <w:br/>
         <w:t xml:space="preserve">        var currentFilePath = control.CurrentFilePath();</w:t>
+      </w:r>
+      <w:r>
         <w:br/>
         <w:t xml:space="preserve">        if (string.IsNullOrWhiteSpace(currentFilePath))</w:t>
+      </w:r>
+      <w:r>
         <w:br/>
         <w:t xml:space="preserve">        {</w:t>
+      </w:r>
+      <w:r>
         <w:br/>
         <w:t xml:space="preserve">            Text = DefaultWindowTitle;</w:t>
+      </w:r>
+      <w:r>
         <w:br/>
         <w:t xml:space="preserve">            return;</w:t>
+      </w:r>
+      <w:r>
         <w:br/>
         <w:t xml:space="preserve">        }</w:t>
-        <w:br/>
+      </w:r>
+      <w:r>
+        <w:br/>
+      </w:r>
+      <w:r>
         <w:br/>
         <w:t xml:space="preserve">        Text = $"{DefaultWindowTitle} - {Path.GetFileName(currentFilePath)}";</w:t>
+      </w:r>
+      <w:r>
         <w:br/>
         <w:t xml:space="preserve">    }</w:t>
+      </w:r>
+      <w:r>
         <w:br/>
         <w:t>}</w:t>
       </w:r>
@@ -2389,33 +3881,63 @@
       </w:pPr>
       <w:r>
         <w:t>namespace PhoneBookLab2.WinForms;</w:t>
-        <w:br/>
+      </w:r>
+      <w:r>
+        <w:br/>
+      </w:r>
+      <w:r>
         <w:br/>
         <w:t>static class Program</w:t>
+      </w:r>
+      <w:r>
         <w:br/>
         <w:t>{</w:t>
+      </w:r>
+      <w:r>
         <w:br/>
         <w:t xml:space="preserve">    /// &lt;summary&gt;</w:t>
+      </w:r>
+      <w:r>
         <w:br/>
         <w:t xml:space="preserve">    ///  The main entry point for the application.</w:t>
+      </w:r>
+      <w:r>
         <w:br/>
         <w:t xml:space="preserve">    /// &lt;/summary&gt;</w:t>
+      </w:r>
+      <w:r>
         <w:br/>
         <w:t xml:space="preserve">    [STAThread]</w:t>
+      </w:r>
+      <w:r>
         <w:br/>
         <w:t xml:space="preserve">    static void Main()</w:t>
+      </w:r>
+      <w:r>
         <w:br/>
         <w:t xml:space="preserve">    {</w:t>
+      </w:r>
+      <w:r>
         <w:br/>
         <w:t xml:space="preserve">        // To customize application configuration such as set high DPI settings or default font,</w:t>
+      </w:r>
+      <w:r>
         <w:br/>
         <w:t xml:space="preserve">        // see https://aka.ms/applicationconfiguration.</w:t>
+      </w:r>
+      <w:r>
         <w:br/>
         <w:t xml:space="preserve">        ApplicationConfiguration.Initialize();</w:t>
+      </w:r>
+      <w:r>
         <w:br/>
         <w:t xml:space="preserve">        Application.Run(new Form1());</w:t>
+      </w:r>
+      <w:r>
         <w:br/>
         <w:t xml:space="preserve">    }    </w:t>
+      </w:r>
+      <w:r>
         <w:br/>
         <w:t>}</w:t>
       </w:r>
@@ -2425,9 +3947,6 @@
         <w:pStyle w:val="3"/>
         <w:spacing w:before="240"/>
         <w:ind w:right="49"/>
-        <w:rPr>
-          <w:lang w:val="ru-RU"/>
-        </w:rPr>
       </w:pPr>
       <w:bookmarkStart w:id="13" w:name="help.txt"/>
       <w:bookmarkEnd w:id="12"/>
@@ -2442,7 +3961,6 @@
         <w:rPr>
           <w:rFonts w:ascii="Times New Roman" w:eastAsia="Times New Roman" w:hAnsi="Times New Roman" w:cs="Times New Roman"/>
           <w:color w:val="000000"/>
-          <w:lang w:val="ru-RU"/>
         </w:rPr>
         <w:t>.</w:t>
       </w:r>
@@ -2458,35 +3976,68 @@
       <w:pPr>
         <w:pStyle w:val="SourceCode"/>
         <w:ind w:right="49"/>
-        <w:rPr>
-          <w:lang w:val="ru-RU"/>
-        </w:rPr>
       </w:pPr>
       <w:r>
         <w:t>﻿Телефонная книга</w:t>
-        <w:br/>
+      </w:r>
+      <w:r>
+        <w:br/>
+      </w:r>
+      <w:r>
         <w:br/>
         <w:t>Ввод, поиск, редактирование и хранение записей абонентов.</w:t>
+      </w:r>
+      <w:r>
         <w:br/>
         <w:t>Основные действия: Добавить, Изменить, Удалить, Сохранить/Открыть.</w:t>
-        <w:br/>
-        <w:br/>
-        <w:t>Бригада №2:</w:t>
+      </w:r>
+      <w:r>
+        <w:br/>
+      </w:r>
+      <w:r>
+        <w:lastRenderedPageBreak/>
+        <w:br/>
+        <w:t>Бригада №2</w:t>
+      </w:r>
+      <w:proofErr w:type="gramStart"/>
+      <w:r>
+        <w:t>:</w:t>
+      </w:r>
+      <w:proofErr w:type="gramEnd"/>
+      <w:r>
         <w:br/>
         <w:t>Весёлый Денис</w:t>
-        <w:br/>
-        <w:t>Ворончук Илья</w:t>
-        <w:br/>
-        <w:t>Лыкова Мария</w:t>
-      </w:r>
+      </w:r>
+      <w:r>
+        <w:br/>
+        <w:t xml:space="preserve">Ворончук </w:t>
+      </w:r>
+      <w:proofErr w:type="spellStart"/>
+      <w:r>
+        <w:t>Илья</w:t>
+      </w:r>
+      <w:proofErr w:type="spellEnd"/>
+      <w:r>
+        <w:br/>
+      </w:r>
+      <w:proofErr w:type="spellStart"/>
+      <w:r>
+        <w:t>Лыкова</w:t>
+      </w:r>
+      <w:proofErr w:type="spellEnd"/>
+      <w:r>
+        <w:t xml:space="preserve"> </w:t>
+      </w:r>
+      <w:proofErr w:type="spellStart"/>
+      <w:r>
+        <w:t>Мария</w:t>
+      </w:r>
+      <w:proofErr w:type="spellEnd"/>
     </w:p>
     <w:p>
       <w:pPr>
         <w:pStyle w:val="2"/>
         <w:ind w:right="49"/>
-        <w:rPr>
-          <w:lang w:val="ru-RU"/>
-        </w:rPr>
       </w:pPr>
       <w:bookmarkStart w:id="14" w:name="Xb122b9355ca8621e15c5f3265c4199aa9ad6685"/>
       <w:bookmarkEnd w:id="5"/>
@@ -2495,9 +4046,91 @@
         <w:rPr>
           <w:rFonts w:ascii="Times New Roman" w:eastAsia="Times New Roman" w:hAnsi="Times New Roman" w:cs="Times New Roman"/>
           <w:color w:val="000000"/>
+        </w:rPr>
+        <w:t xml:space="preserve">5. </w:t>
+      </w:r>
+      <w:r>
+        <w:rPr>
+          <w:rFonts w:ascii="Times New Roman" w:eastAsia="Times New Roman" w:hAnsi="Times New Roman" w:cs="Times New Roman"/>
+          <w:color w:val="000000"/>
           <w:lang w:val="ru-RU"/>
         </w:rPr>
-        <w:t>5. Тестовые наборы данных и результаты тестирования</w:t>
+        <w:t>Тестовые</w:t>
+      </w:r>
+      <w:r>
+        <w:rPr>
+          <w:rFonts w:ascii="Times New Roman" w:eastAsia="Times New Roman" w:hAnsi="Times New Roman" w:cs="Times New Roman"/>
+          <w:color w:val="000000"/>
+        </w:rPr>
+        <w:t xml:space="preserve"> </w:t>
+      </w:r>
+      <w:r>
+        <w:rPr>
+          <w:rFonts w:ascii="Times New Roman" w:eastAsia="Times New Roman" w:hAnsi="Times New Roman" w:cs="Times New Roman"/>
+          <w:color w:val="000000"/>
+          <w:lang w:val="ru-RU"/>
+        </w:rPr>
+        <w:t>наборы</w:t>
+      </w:r>
+      <w:r>
+        <w:rPr>
+          <w:rFonts w:ascii="Times New Roman" w:eastAsia="Times New Roman" w:hAnsi="Times New Roman" w:cs="Times New Roman"/>
+          <w:color w:val="000000"/>
+        </w:rPr>
+        <w:t xml:space="preserve"> </w:t>
+      </w:r>
+      <w:r>
+        <w:rPr>
+          <w:rFonts w:ascii="Times New Roman" w:eastAsia="Times New Roman" w:hAnsi="Times New Roman" w:cs="Times New Roman"/>
+          <w:color w:val="000000"/>
+          <w:lang w:val="ru-RU"/>
+        </w:rPr>
+        <w:t>данных</w:t>
+      </w:r>
+      <w:r>
+        <w:rPr>
+          <w:rFonts w:ascii="Times New Roman" w:eastAsia="Times New Roman" w:hAnsi="Times New Roman" w:cs="Times New Roman"/>
+          <w:color w:val="000000"/>
+        </w:rPr>
+        <w:t xml:space="preserve"> </w:t>
+      </w:r>
+      <w:r>
+        <w:rPr>
+          <w:rFonts w:ascii="Times New Roman" w:eastAsia="Times New Roman" w:hAnsi="Times New Roman" w:cs="Times New Roman"/>
+          <w:color w:val="000000"/>
+          <w:lang w:val="ru-RU"/>
+        </w:rPr>
+        <w:t>и</w:t>
+      </w:r>
+      <w:r>
+        <w:rPr>
+          <w:rFonts w:ascii="Times New Roman" w:eastAsia="Times New Roman" w:hAnsi="Times New Roman" w:cs="Times New Roman"/>
+          <w:color w:val="000000"/>
+        </w:rPr>
+        <w:t xml:space="preserve"> </w:t>
+      </w:r>
+      <w:r>
+        <w:rPr>
+          <w:rFonts w:ascii="Times New Roman" w:eastAsia="Times New Roman" w:hAnsi="Times New Roman" w:cs="Times New Roman"/>
+          <w:color w:val="000000"/>
+          <w:lang w:val="ru-RU"/>
+        </w:rPr>
+        <w:t>результаты</w:t>
+      </w:r>
+      <w:r>
+        <w:rPr>
+          <w:rFonts w:ascii="Times New Roman" w:eastAsia="Times New Roman" w:hAnsi="Times New Roman" w:cs="Times New Roman"/>
+          <w:color w:val="000000"/>
+        </w:rPr>
+        <w:t xml:space="preserve"> </w:t>
+      </w:r>
+      <w:r>
+        <w:rPr>
+          <w:rFonts w:ascii="Times New Roman" w:eastAsia="Times New Roman" w:hAnsi="Times New Roman" w:cs="Times New Roman"/>
+          <w:color w:val="000000"/>
+          <w:lang w:val="ru-RU"/>
+        </w:rPr>
+        <w:t>тестирования</w:t>
       </w:r>
     </w:p>
     <w:tbl>
@@ -2508,10 +4141,10 @@
         <w:tblLook w:val="0020" w:firstRow="1" w:lastRow="0" w:firstColumn="0" w:lastColumn="0" w:noHBand="0" w:noVBand="0"/>
       </w:tblPr>
       <w:tblGrid>
-        <w:gridCol w:w="694"/>
-        <w:gridCol w:w="2625"/>
-        <w:gridCol w:w="3207"/>
-        <w:gridCol w:w="3662"/>
+        <w:gridCol w:w="672"/>
+        <w:gridCol w:w="2539"/>
+        <w:gridCol w:w="3102"/>
+        <w:gridCol w:w="3541"/>
       </w:tblGrid>
       <w:tr>
         <w:tc>
@@ -2623,6 +4256,269 @@
                 <w:rStyle w:val="VerbatimChar"/>
               </w:rPr>
               <w:t>Petrov, 200</w:t>
+            </w:r>
+          </w:p>
+        </w:tc>
+        <w:tc>
+          <w:tcPr>
+            <w:tcW w:w="3560" w:type="dxa"/>
+          </w:tcPr>
+          <w:p>
+            <w:pPr>
+              <w:pStyle w:val="Compact"/>
+              <w:ind w:right="49"/>
+            </w:pPr>
+            <w:r>
+              <w:rPr>
+                <w:lang w:val="ru-RU"/>
+              </w:rPr>
+              <w:t>Запись</w:t>
+            </w:r>
+            <w:r>
+              <w:t xml:space="preserve"> </w:t>
+            </w:r>
+            <w:r>
+              <w:rPr>
+                <w:rStyle w:val="VerbatimChar"/>
+              </w:rPr>
+              <w:t>Ivanov</w:t>
+            </w:r>
+            <w:r>
+              <w:rPr>
+                <w:rStyle w:val="VerbatimChar"/>
+              </w:rPr>
+              <w:t>, 100</w:t>
+            </w:r>
+            <w:r>
+              <w:t xml:space="preserve"> </w:t>
+            </w:r>
+            <w:r>
+              <w:rPr>
+                <w:lang w:val="ru-RU"/>
+              </w:rPr>
+              <w:t>найдена</w:t>
+            </w:r>
+            <w:r>
+              <w:t xml:space="preserve">, </w:t>
+            </w:r>
+            <w:r>
+              <w:rPr>
+                <w:lang w:val="ru-RU"/>
+              </w:rPr>
+              <w:t>количество</w:t>
+            </w:r>
+            <w:r>
+              <w:t xml:space="preserve"> </w:t>
+            </w:r>
+            <w:r>
+              <w:rPr>
+                <w:lang w:val="ru-RU"/>
+              </w:rPr>
+              <w:t>записей</w:t>
+            </w:r>
+            <w:r>
+              <w:t xml:space="preserve"> </w:t>
+            </w:r>
+            <w:r>
+              <w:rPr>
+                <w:lang w:val="ru-RU"/>
+              </w:rPr>
+              <w:t>корректно</w:t>
+            </w:r>
+          </w:p>
+        </w:tc>
+      </w:tr>
+      <w:tr>
+        <w:tc>
+          <w:tcPr>
+            <w:tcW w:w="675" w:type="dxa"/>
+          </w:tcPr>
+          <w:p>
+            <w:pPr>
+              <w:pStyle w:val="Compact"/>
+              <w:ind w:right="49"/>
+            </w:pPr>
+            <w:r>
+              <w:t>2</w:t>
+            </w:r>
+          </w:p>
+        </w:tc>
+        <w:tc>
+          <w:tcPr>
+            <w:tcW w:w="2552" w:type="dxa"/>
+          </w:tcPr>
+          <w:p>
+            <w:pPr>
+              <w:pStyle w:val="Compact"/>
+              <w:ind w:right="49"/>
+            </w:pPr>
+            <w:r>
+              <w:t>Удаление выделенной записи</w:t>
+            </w:r>
+          </w:p>
+        </w:tc>
+        <w:tc>
+          <w:tcPr>
+            <w:tcW w:w="3118" w:type="dxa"/>
+          </w:tcPr>
+          <w:p>
+            <w:pPr>
+              <w:pStyle w:val="Compact"/>
+              <w:ind w:right="49"/>
+            </w:pPr>
+            <w:r>
+              <w:rPr>
+                <w:lang w:val="ru-RU"/>
+              </w:rPr>
+              <w:t>Список</w:t>
+            </w:r>
+            <w:r>
+              <w:t xml:space="preserve"> </w:t>
+            </w:r>
+            <w:r>
+              <w:rPr>
+                <w:lang w:val="ru-RU"/>
+              </w:rPr>
+              <w:t>из</w:t>
+            </w:r>
+            <w:r>
+              <w:t xml:space="preserve"> 2 </w:t>
+            </w:r>
+            <w:r>
+              <w:rPr>
+                <w:lang w:val="ru-RU"/>
+              </w:rPr>
+              <w:t>записей</w:t>
+            </w:r>
+            <w:r>
+              <w:t xml:space="preserve">, </w:t>
+            </w:r>
+            <w:r>
+              <w:rPr>
+                <w:lang w:val="ru-RU"/>
+              </w:rPr>
+              <w:t>удаление</w:t>
+            </w:r>
+            <w:r>
+              <w:t xml:space="preserve"> </w:t>
+            </w:r>
+            <w:r>
+              <w:rPr>
+                <w:lang w:val="ru-RU"/>
+              </w:rPr>
+              <w:t>по</w:t>
+            </w:r>
+            <w:r>
+              <w:t xml:space="preserve"> </w:t>
+            </w:r>
+            <w:r>
+              <w:rPr>
+                <w:lang w:val="ru-RU"/>
+              </w:rPr>
+              <w:t>индексу</w:t>
+            </w:r>
+            <w:r>
+              <w:t xml:space="preserve"> </w:t>
+            </w:r>
+            <w:r>
+              <w:rPr>
+                <w:rStyle w:val="VerbatimChar"/>
+              </w:rPr>
+              <w:t>0</w:t>
+            </w:r>
+          </w:p>
+        </w:tc>
+        <w:tc>
+          <w:tcPr>
+            <w:tcW w:w="3560" w:type="dxa"/>
+          </w:tcPr>
+          <w:p>
+            <w:pPr>
+              <w:pStyle w:val="Compact"/>
+              <w:ind w:right="49"/>
+            </w:pPr>
+            <w:r>
+              <w:t xml:space="preserve">В </w:t>
+            </w:r>
+            <w:proofErr w:type="spellStart"/>
+            <w:r>
+              <w:t>списке</w:t>
+            </w:r>
+            <w:proofErr w:type="spellEnd"/>
+            <w:r>
+              <w:t xml:space="preserve"> </w:t>
+            </w:r>
+            <w:proofErr w:type="spellStart"/>
+            <w:r>
+              <w:t>остаётся</w:t>
+            </w:r>
+            <w:proofErr w:type="spellEnd"/>
+            <w:r>
+              <w:t xml:space="preserve"> 1 </w:t>
+            </w:r>
+            <w:proofErr w:type="spellStart"/>
+            <w:r>
+              <w:t>запись</w:t>
+            </w:r>
+            <w:proofErr w:type="spellEnd"/>
+          </w:p>
+        </w:tc>
+      </w:tr>
+      <w:tr>
+        <w:tc>
+          <w:tcPr>
+            <w:tcW w:w="675" w:type="dxa"/>
+          </w:tcPr>
+          <w:p>
+            <w:pPr>
+              <w:pStyle w:val="Compact"/>
+              <w:ind w:right="49"/>
+            </w:pPr>
+            <w:r>
+              <w:t>3</w:t>
+            </w:r>
+          </w:p>
+        </w:tc>
+        <w:tc>
+          <w:tcPr>
+            <w:tcW w:w="2552" w:type="dxa"/>
+          </w:tcPr>
+          <w:p>
+            <w:pPr>
+              <w:pStyle w:val="Compact"/>
+              <w:ind w:right="49"/>
+            </w:pPr>
+            <w:r>
+              <w:t>Редактирование записи</w:t>
+            </w:r>
+          </w:p>
+        </w:tc>
+        <w:tc>
+          <w:tcPr>
+            <w:tcW w:w="3118" w:type="dxa"/>
+          </w:tcPr>
+          <w:p>
+            <w:pPr>
+              <w:pStyle w:val="Compact"/>
+              <w:ind w:right="49"/>
+            </w:pPr>
+            <w:r>
+              <w:t xml:space="preserve">Обновление </w:t>
+            </w:r>
+            <w:r>
+              <w:rPr>
+                <w:rStyle w:val="VerbatimChar"/>
+              </w:rPr>
+              <w:t>Petrov, 200</w:t>
+            </w:r>
+            <w:r>
+              <w:t xml:space="preserve"> в </w:t>
+            </w:r>
+            <w:r>
+              <w:rPr>
+                <w:rStyle w:val="VerbatimChar"/>
+              </w:rPr>
+              <w:t>Alekseev, 900</w:t>
             </w:r>
           </w:p>
         </w:tc>
@@ -2642,20 +4538,7 @@
               <w:rPr>
                 <w:lang w:val="ru-RU"/>
               </w:rPr>
-              <w:t xml:space="preserve">Запись </w:t>
-            </w:r>
-            <w:r>
-              <w:rPr>
-                <w:rStyle w:val="VerbatimChar"/>
-              </w:rPr>
-              <w:t>Ivanov</w:t>
-            </w:r>
-            <w:r>
-              <w:rPr>
-                <w:rStyle w:val="VerbatimChar"/>
-                <w:lang w:val="ru-RU"/>
-              </w:rPr>
-              <w:t>, 100</w:t>
+              <w:t>Запись</w:t>
             </w:r>
             <w:r>
               <w:rPr>
@@ -2667,7 +4550,43 @@
               <w:rPr>
                 <w:lang w:val="ru-RU"/>
               </w:rPr>
-              <w:t>найдена, количество записей корректно</w:t>
+              <w:t>обновлена</w:t>
+            </w:r>
+            <w:r>
+              <w:rPr>
+                <w:lang w:val="ru-RU"/>
+              </w:rPr>
+              <w:t xml:space="preserve">, </w:t>
+            </w:r>
+            <w:r>
+              <w:rPr>
+                <w:lang w:val="ru-RU"/>
+              </w:rPr>
+              <w:t>список</w:t>
+            </w:r>
+            <w:r>
+              <w:rPr>
+                <w:lang w:val="ru-RU"/>
+              </w:rPr>
+              <w:t xml:space="preserve"> </w:t>
+            </w:r>
+            <w:r>
+              <w:rPr>
+                <w:lang w:val="ru-RU"/>
+              </w:rPr>
+              <w:t>остаётся</w:t>
+            </w:r>
+            <w:r>
+              <w:rPr>
+                <w:lang w:val="ru-RU"/>
+              </w:rPr>
+              <w:t xml:space="preserve"> </w:t>
+            </w:r>
+            <w:r>
+              <w:rPr>
+                <w:lang w:val="ru-RU"/>
+              </w:rPr>
+              <w:t>отсортированным</w:t>
             </w:r>
           </w:p>
         </w:tc>
@@ -2683,7 +4602,7 @@
               <w:ind w:right="49"/>
             </w:pPr>
             <w:r>
-              <w:t>2</w:t>
+              <w:t>4</w:t>
             </w:r>
           </w:p>
         </w:tc>
@@ -2697,7 +4616,7 @@
               <w:ind w:right="49"/>
             </w:pPr>
             <w:r>
-              <w:t>Удаление выделенной записи</w:t>
+              <w:t>Сохранение и загрузка книги</w:t>
             </w:r>
           </w:p>
         </w:tc>
@@ -2717,103 +4636,28 @@
               <w:rPr>
                 <w:lang w:val="ru-RU"/>
               </w:rPr>
-              <w:t xml:space="preserve">Список из 2 записей, удаление по индексу </w:t>
+              <w:t xml:space="preserve">Сохранение в </w:t>
             </w:r>
             <w:r>
               <w:rPr>
                 <w:rStyle w:val="VerbatimChar"/>
                 <w:lang w:val="ru-RU"/>
               </w:rPr>
-              <w:t>0</w:t>
-            </w:r>
-          </w:p>
-        </w:tc>
-        <w:tc>
-          <w:tcPr>
-            <w:tcW w:w="3560" w:type="dxa"/>
-          </w:tcPr>
-          <w:p>
-            <w:pPr>
-              <w:pStyle w:val="Compact"/>
-              <w:ind w:right="49"/>
-            </w:pPr>
-            <w:r>
-              <w:t xml:space="preserve">В </w:t>
+              <w:t>*.</w:t>
             </w:r>
             <w:proofErr w:type="spellStart"/>
-            <w:r>
-              <w:t>списке</w:t>
-            </w:r>
-            <w:proofErr w:type="spellEnd"/>
-            <w:r>
-              <w:t xml:space="preserve"> </w:t>
-            </w:r>
-            <w:proofErr w:type="spellStart"/>
-            <w:r>
-              <w:t>остаётся</w:t>
-            </w:r>
-            <w:proofErr w:type="spellEnd"/>
-            <w:r>
-              <w:t xml:space="preserve"> 1 запись</w:t>
-            </w:r>
-          </w:p>
-        </w:tc>
-      </w:tr>
-      <w:tr>
-        <w:tc>
-          <w:tcPr>
-            <w:tcW w:w="675" w:type="dxa"/>
-          </w:tcPr>
-          <w:p>
-            <w:pPr>
-              <w:pStyle w:val="Compact"/>
-              <w:ind w:right="49"/>
-            </w:pPr>
-            <w:r>
-              <w:t>3</w:t>
-            </w:r>
-          </w:p>
-        </w:tc>
-        <w:tc>
-          <w:tcPr>
-            <w:tcW w:w="2552" w:type="dxa"/>
-          </w:tcPr>
-          <w:p>
-            <w:pPr>
-              <w:pStyle w:val="Compact"/>
-              <w:ind w:right="49"/>
-            </w:pPr>
-            <w:r>
-              <w:t>Редактирование записи</w:t>
-            </w:r>
-          </w:p>
-        </w:tc>
-        <w:tc>
-          <w:tcPr>
-            <w:tcW w:w="3118" w:type="dxa"/>
-          </w:tcPr>
-          <w:p>
-            <w:pPr>
-              <w:pStyle w:val="Compact"/>
-              <w:ind w:right="49"/>
-            </w:pPr>
-            <w:r>
-              <w:t xml:space="preserve">Обновление </w:t>
-            </w:r>
             <w:r>
               <w:rPr>
                 <w:rStyle w:val="VerbatimChar"/>
               </w:rPr>
-              <w:t>Petrov, 200</w:t>
-            </w:r>
-            <w:r>
-              <w:t xml:space="preserve"> в </w:t>
-            </w:r>
+              <w:t>pbk</w:t>
+            </w:r>
+            <w:proofErr w:type="spellEnd"/>
             <w:r>
               <w:rPr>
-                <w:rStyle w:val="VerbatimChar"/>
+                <w:lang w:val="ru-RU"/>
               </w:rPr>
-              <w:t>Alekseev, 900</w:t>
+              <w:t>, затем чтение файла</w:t>
             </w:r>
           </w:p>
         </w:tc>
@@ -2833,7 +4677,7 @@
               <w:rPr>
                 <w:lang w:val="ru-RU"/>
               </w:rPr>
-              <w:t>Запись обновлена, список остаётся отсортированным</w:t>
+              <w:t>Состав и порядок записей восстановлены</w:t>
             </w:r>
           </w:p>
         </w:tc>
@@ -2849,7 +4693,7 @@
               <w:ind w:right="49"/>
             </w:pPr>
             <w:r>
-              <w:t>4</w:t>
+              <w:t>5</w:t>
             </w:r>
           </w:p>
         </w:tc>
@@ -2863,10 +4707,7 @@
               <w:ind w:right="49"/>
             </w:pPr>
             <w:r>
-              <w:t>С</w:t>
-            </w:r>
-            <w:r>
-              <w:t>охранение и загрузка книги</w:t>
+              <w:t>Очистка книги</w:t>
             </w:r>
           </w:p>
         </w:tc>
@@ -2886,28 +4727,7 @@
               <w:rPr>
                 <w:lang w:val="ru-RU"/>
               </w:rPr>
-              <w:t xml:space="preserve">Сохранение в </w:t>
-            </w:r>
-            <w:r>
-              <w:rPr>
-                <w:rStyle w:val="VerbatimChar"/>
-                <w:lang w:val="ru-RU"/>
-              </w:rPr>
-              <w:t>*.</w:t>
-            </w:r>
-            <w:proofErr w:type="spellStart"/>
-            <w:r>
-              <w:rPr>
-                <w:rStyle w:val="VerbatimChar"/>
-              </w:rPr>
-              <w:t>pbk</w:t>
-            </w:r>
-            <w:proofErr w:type="spellEnd"/>
-            <w:r>
-              <w:rPr>
-                <w:lang w:val="ru-RU"/>
-              </w:rPr>
-              <w:t>, затем чтение файла</w:t>
+              <w:t>Книга с записями, команда очистки</w:t>
             </w:r>
           </w:p>
         </w:tc>
@@ -2919,15 +4739,36 @@
             <w:pPr>
               <w:pStyle w:val="Compact"/>
               <w:ind w:right="49"/>
+            </w:pPr>
+            <w:proofErr w:type="spellStart"/>
+            <w:r>
+              <w:t>Количество</w:t>
+            </w:r>
+            <w:proofErr w:type="spellEnd"/>
+            <w:r>
+              <w:t xml:space="preserve"> </w:t>
+            </w:r>
+            <w:proofErr w:type="spellStart"/>
+            <w:r>
+              <w:t>записей</w:t>
+            </w:r>
+            <w:proofErr w:type="spellEnd"/>
+            <w:r>
+              <w:t xml:space="preserve"> </w:t>
+            </w:r>
+            <w:proofErr w:type="spellStart"/>
+            <w:r>
+              <w:t>равно</w:t>
+            </w:r>
+            <w:proofErr w:type="spellEnd"/>
+            <w:r>
+              <w:t xml:space="preserve"> </w:t>
+            </w:r>
+            <w:r>
               <w:rPr>
-                <w:lang w:val="ru-RU"/>
+                <w:rStyle w:val="VerbatimChar"/>
               </w:rPr>
-            </w:pPr>
-            <w:r>
-              <w:rPr>
-                <w:lang w:val="ru-RU"/>
-              </w:rPr>
-              <w:t>Состав и порядок записей восстановлены</w:t>
+              <w:t>0</w:t>
             </w:r>
           </w:p>
         </w:tc>
@@ -2943,7 +4784,7 @@
               <w:ind w:right="49"/>
             </w:pPr>
             <w:r>
-              <w:t>5</w:t>
+              <w:t>6</w:t>
             </w:r>
           </w:p>
         </w:tc>
@@ -2957,7 +4798,113 @@
               <w:ind w:right="49"/>
             </w:pPr>
             <w:r>
-              <w:t>Очистка книги</w:t>
+              <w:t xml:space="preserve">Проверка класса </w:t>
+            </w:r>
+            <w:r>
+              <w:rPr>
+                <w:rStyle w:val="VerbatimChar"/>
+              </w:rPr>
+              <w:t>Abonent</w:t>
+            </w:r>
+          </w:p>
+        </w:tc>
+        <w:tc>
+          <w:tcPr>
+            <w:tcW w:w="3118" w:type="dxa"/>
+          </w:tcPr>
+          <w:p>
+            <w:pPr>
+              <w:pStyle w:val="Compact"/>
+              <w:ind w:right="49"/>
+            </w:pPr>
+            <w:r>
+              <w:t>Чтение, запись, сравнение записей</w:t>
+            </w:r>
+          </w:p>
+        </w:tc>
+        <w:tc>
+          <w:tcPr>
+            <w:tcW w:w="3560" w:type="dxa"/>
+          </w:tcPr>
+          <w:p>
+            <w:pPr>
+              <w:pStyle w:val="Compact"/>
+              <w:ind w:right="49"/>
+            </w:pPr>
+            <w:r>
+              <w:t xml:space="preserve">Методы </w:t>
+            </w:r>
+            <w:r>
+              <w:rPr>
+                <w:rStyle w:val="VerbatimChar"/>
+              </w:rPr>
+              <w:t>Read</w:t>
+            </w:r>
+            <w:r>
+              <w:t xml:space="preserve">, </w:t>
+            </w:r>
+            <w:r>
+              <w:rPr>
+                <w:rStyle w:val="VerbatimChar"/>
+              </w:rPr>
+              <w:t>Write</w:t>
+            </w:r>
+            <w:r>
+              <w:t xml:space="preserve">, </w:t>
+            </w:r>
+            <w:r>
+              <w:rPr>
+                <w:rStyle w:val="VerbatimChar"/>
+              </w:rPr>
+              <w:t>Less</w:t>
+            </w:r>
+            <w:r>
+              <w:t xml:space="preserve">, </w:t>
+            </w:r>
+            <w:r>
+              <w:rPr>
+                <w:rStyle w:val="VerbatimChar"/>
+              </w:rPr>
+              <w:t>EqualsRecord</w:t>
+            </w:r>
+            <w:r>
+              <w:t xml:space="preserve"> работают корректно</w:t>
+            </w:r>
+          </w:p>
+        </w:tc>
+      </w:tr>
+      <w:tr>
+        <w:tc>
+          <w:tcPr>
+            <w:tcW w:w="675" w:type="dxa"/>
+          </w:tcPr>
+          <w:p>
+            <w:pPr>
+              <w:pStyle w:val="Compact"/>
+              <w:ind w:right="49"/>
+            </w:pPr>
+            <w:r>
+              <w:t>7</w:t>
+            </w:r>
+          </w:p>
+        </w:tc>
+        <w:tc>
+          <w:tcPr>
+            <w:tcW w:w="2552" w:type="dxa"/>
+          </w:tcPr>
+          <w:p>
+            <w:pPr>
+              <w:pStyle w:val="Compact"/>
+              <w:ind w:right="49"/>
+            </w:pPr>
+            <w:r>
+              <w:t xml:space="preserve">Проверка класса </w:t>
+            </w:r>
+            <w:r>
+              <w:rPr>
+                <w:rStyle w:val="VerbatimChar"/>
+              </w:rPr>
+              <w:t>AbonentList</w:t>
             </w:r>
           </w:p>
         </w:tc>
@@ -2977,7 +4924,7 @@
               <w:rPr>
                 <w:lang w:val="ru-RU"/>
               </w:rPr>
-              <w:t>Книга с записями, команда очистки</w:t>
+              <w:t>Добавление, поиск, удаление, замена списка</w:t>
             </w:r>
           </w:p>
         </w:tc>
@@ -2992,206 +4939,6 @@
             </w:pPr>
             <w:proofErr w:type="spellStart"/>
             <w:r>
-              <w:t>Количество</w:t>
-            </w:r>
-            <w:proofErr w:type="spellEnd"/>
-            <w:r>
-              <w:t xml:space="preserve"> </w:t>
-            </w:r>
-            <w:proofErr w:type="spellStart"/>
-            <w:r>
-              <w:t>записей</w:t>
-            </w:r>
-            <w:proofErr w:type="spellEnd"/>
-            <w:r>
-              <w:t xml:space="preserve"> </w:t>
-            </w:r>
-            <w:proofErr w:type="spellStart"/>
-            <w:r>
-              <w:t>равно</w:t>
-            </w:r>
-            <w:proofErr w:type="spellEnd"/>
-            <w:r>
-              <w:t xml:space="preserve"> </w:t>
-            </w:r>
-            <w:r>
-              <w:rPr>
-                <w:rStyle w:val="VerbatimChar"/>
-              </w:rPr>
-              <w:t>0</w:t>
-            </w:r>
-          </w:p>
-        </w:tc>
-      </w:tr>
-      <w:tr>
-        <w:tc>
-          <w:tcPr>
-            <w:tcW w:w="675" w:type="dxa"/>
-          </w:tcPr>
-          <w:p>
-            <w:pPr>
-              <w:pStyle w:val="Compact"/>
-              <w:ind w:right="49"/>
-            </w:pPr>
-            <w:r>
-              <w:t>6</w:t>
-            </w:r>
-          </w:p>
-        </w:tc>
-        <w:tc>
-          <w:tcPr>
-            <w:tcW w:w="2552" w:type="dxa"/>
-          </w:tcPr>
-          <w:p>
-            <w:pPr>
-              <w:pStyle w:val="Compact"/>
-              <w:ind w:right="49"/>
-            </w:pPr>
-            <w:r>
-              <w:t xml:space="preserve">Проверка класса </w:t>
-            </w:r>
-            <w:r>
-              <w:rPr>
-                <w:rStyle w:val="VerbatimChar"/>
-              </w:rPr>
-              <w:t>Abonent</w:t>
-            </w:r>
-          </w:p>
-        </w:tc>
-        <w:tc>
-          <w:tcPr>
-            <w:tcW w:w="3118" w:type="dxa"/>
-          </w:tcPr>
-          <w:p>
-            <w:pPr>
-              <w:pStyle w:val="Compact"/>
-              <w:ind w:right="49"/>
-            </w:pPr>
-            <w:r>
-              <w:t>Чтение, запись, сравнение записей</w:t>
-            </w:r>
-          </w:p>
-        </w:tc>
-        <w:tc>
-          <w:tcPr>
-            <w:tcW w:w="3560" w:type="dxa"/>
-          </w:tcPr>
-          <w:p>
-            <w:pPr>
-              <w:pStyle w:val="Compact"/>
-              <w:ind w:right="49"/>
-            </w:pPr>
-            <w:r>
-              <w:t xml:space="preserve">Методы </w:t>
-            </w:r>
-            <w:r>
-              <w:rPr>
-                <w:rStyle w:val="VerbatimChar"/>
-              </w:rPr>
-              <w:t>Read</w:t>
-            </w:r>
-            <w:r>
-              <w:t>,</w:t>
-            </w:r>
-            <w:r>
-              <w:t xml:space="preserve"> </w:t>
-            </w:r>
-            <w:r>
-              <w:rPr>
-                <w:rStyle w:val="VerbatimChar"/>
-              </w:rPr>
-              <w:t>Write</w:t>
-            </w:r>
-            <w:r>
-              <w:t xml:space="preserve">, </w:t>
-            </w:r>
-            <w:r>
-              <w:rPr>
-                <w:rStyle w:val="VerbatimChar"/>
-              </w:rPr>
-              <w:t>Less</w:t>
-            </w:r>
-            <w:r>
-              <w:t xml:space="preserve">, </w:t>
-            </w:r>
-            <w:r>
-              <w:rPr>
-                <w:rStyle w:val="VerbatimChar"/>
-              </w:rPr>
-              <w:t>EqualsRecord</w:t>
-            </w:r>
-            <w:r>
-              <w:t xml:space="preserve"> работают корректно</w:t>
-            </w:r>
-          </w:p>
-        </w:tc>
-      </w:tr>
-      <w:tr>
-        <w:tc>
-          <w:tcPr>
-            <w:tcW w:w="675" w:type="dxa"/>
-          </w:tcPr>
-          <w:p>
-            <w:pPr>
-              <w:pStyle w:val="Compact"/>
-              <w:ind w:right="49"/>
-            </w:pPr>
-            <w:r>
-              <w:t>7</w:t>
-            </w:r>
-          </w:p>
-        </w:tc>
-        <w:tc>
-          <w:tcPr>
-            <w:tcW w:w="2552" w:type="dxa"/>
-          </w:tcPr>
-          <w:p>
-            <w:pPr>
-              <w:pStyle w:val="Compact"/>
-              <w:ind w:right="49"/>
-            </w:pPr>
-            <w:r>
-              <w:t xml:space="preserve">Проверка класса </w:t>
-            </w:r>
-            <w:r>
-              <w:rPr>
-                <w:rStyle w:val="VerbatimChar"/>
-              </w:rPr>
-              <w:t>AbonentList</w:t>
-            </w:r>
-          </w:p>
-        </w:tc>
-        <w:tc>
-          <w:tcPr>
-            <w:tcW w:w="3118" w:type="dxa"/>
-          </w:tcPr>
-          <w:p>
-            <w:pPr>
-              <w:pStyle w:val="Compact"/>
-              <w:ind w:right="49"/>
-              <w:rPr>
-                <w:lang w:val="ru-RU"/>
-              </w:rPr>
-            </w:pPr>
-            <w:r>
-              <w:rPr>
-                <w:lang w:val="ru-RU"/>
-              </w:rPr>
-              <w:t>Добавление, поиск, удаление, замена списка</w:t>
-            </w:r>
-          </w:p>
-        </w:tc>
-        <w:tc>
-          <w:tcPr>
-            <w:tcW w:w="3560" w:type="dxa"/>
-          </w:tcPr>
-          <w:p>
-            <w:pPr>
-              <w:pStyle w:val="Compact"/>
-              <w:ind w:right="49"/>
-            </w:pPr>
-            <w:proofErr w:type="spellStart"/>
-            <w:r>
               <w:t>Операции</w:t>
             </w:r>
             <w:proofErr w:type="spellEnd"/>
@@ -3295,7 +5042,13 @@
           <w:rFonts w:eastAsia="Consolas" w:cs="Consolas"/>
           <w:sz w:val="24"/>
         </w:rPr>
-        <w:t>dotnet test lab2/tests/PhoneBookLab2.Tests/PhoneBook</w:t>
+        <w:t>dotnet test lab2/tests/PhoneBookLab2.Tests/PhoneBookLab2.Tests.csproj</w:t>
+      </w:r>
+      <w:r>
+        <w:rPr>
+          <w:rFonts w:ascii="Consolas" w:eastAsia="Consolas" w:hAnsi="Consolas" w:cs="Consolas"/>
+        </w:rPr>
+        <w:br/>
       </w:r>
       <w:r>
         <w:rPr>
@@ -3303,30 +5056,16 @@
           <w:rFonts w:eastAsia="Consolas" w:cs="Consolas"/>
           <w:sz w:val="24"/>
         </w:rPr>
-        <w:t>Lab2.Tests.csproj</w:t>
-      </w:r>
-      <w:r>
-        <w:rPr>
-          <w:rFonts w:ascii="Consolas" w:eastAsia="Consolas" w:hAnsi="Consolas" w:cs="Consolas"/>
-        </w:rPr>
-        <w:br/>
-      </w:r>
-      <w:r>
-        <w:rPr>
-          <w:rStyle w:val="VerbatimChar"/>
-          <w:rFonts w:eastAsia="Consolas" w:cs="Consolas"/>
-          <w:sz w:val="24"/>
-        </w:rPr>
         <w:t>Пройден! : не пройдено 0, пройдено 13, пропущено 0, всего 13.</w:t>
       </w:r>
-      <w:bookmarkEnd w:id="0"/>
+      <w:bookmarkEnd w:id="1"/>
       <w:bookmarkEnd w:id="14"/>
     </w:p>
     <w:sectPr>
       <w:footnotePr>
         <w:numRestart w:val="eachSect"/>
       </w:footnotePr>
-      <w:pgSz w:w="12240" w:h="15840" w:code="1"/>
+      <w:pgSz w:w="11906" w:h="16838" w:code="9"/>
       <w:pgMar w:top="1134" w:right="1134" w:bottom="1134" w:left="1134" w:header="720" w:footer="720" w:gutter="0"/>
       <w:pgBorders>
         <w:top w:val="single" w:sz="4" w:space="1" w:color="auto"/>
@@ -3689,6 +5428,13 @@
     <w:lsdException w:name="Medium Shading 2"/>
     <w:lsdException w:name="Medium List 1"/>
     <w:lsdException w:name="Medium List 2"/>
+    <w:lsdException w:name="Medium Grid 1"/>
+    <w:lsdException w:name="Medium Grid 2"/>
+    <w:lsdException w:name="Medium Grid 3"/>
+    <w:lsdException w:name="Dark List"/>
+    <w:lsdException w:name="Colorful Shading"/>
+    <w:lsdException w:name="Colorful List"/>
+    <w:lsdException w:name="Colorful Grid"/>
     <w:lsdException w:name="Light Shading Accent 1"/>
     <w:lsdException w:name="Light List Accent 1"/>
     <w:lsdException w:name="Light Grid Accent 1"/>
@@ -5146,7 +6892,7 @@
 </file>
 
 <file path=customXml/itemProps1.xml><?xml version="1.0" encoding="utf-8"?>
-<ds:datastoreItem xmlns:ds="http://schemas.openxmlformats.org/officeDocument/2006/customXml" ds:itemID="{BEAA4FAD-42C3-4CA5-8A2D-2DAE34E1AE2F}">
+<ds:datastoreItem xmlns:ds="http://schemas.openxmlformats.org/officeDocument/2006/customXml" ds:itemID="{9B8C6163-1D03-4FF9-85EF-A068D1C725C7}">
   <ds:schemaRefs>
     <ds:schemaRef ds:uri="http://schemas.openxmlformats.org/officeDocument/2006/bibliography"/>
   </ds:schemaRefs>

</xml_diff>